<commit_message>
docs: rebuild lab 2 report in the ITiVP structure
</commit_message>
<xml_diff>
--- a/airp/lab2/report/Отчет_ЛР2.docx
+++ b/airp/lab2/report/Отчет_ЛР2.docx
@@ -142,6 +142,15 @@
     <w:p>
       <w:pPr>
         <w:keepLines/>
+        <w:jc w:val="center"/>
+      </w:pPr>
+      <w:r>
+        <w:t>Вариант 2</w:t>
+      </w:r>
+    </w:p>
+    <w:p>
+      <w:pPr>
+        <w:keepLines/>
       </w:pPr>
     </w:p>
     <w:p>
@@ -188,7 +197,7 @@
       </w:pPr>
       <w:r>
         <w:tab/>
-        <w:t>К. А. Хаджинова</w:t>
+        <w:t>К.А. Хаджинова</w:t>
       </w:r>
     </w:p>
     <w:p>
@@ -213,7 +222,7 @@
       </w:r>
       <w:r>
         <w:tab/>
-        <w:t>Ю. О. Герман</w:t>
+        <w:t>Ю.О. Герман</w:t>
       </w:r>
     </w:p>
     <w:p>
@@ -297,13 +306,13 @@
       <w:r>
         <w:fldChar w:fldCharType="separate"/>
       </w:r>
-      <w:hyperlink w:anchor="_Toc242426566" w:history="1">
+      <w:hyperlink w:anchor="_Toc242612908" w:history="1">
         <w:r>
           <w:rPr>
             <w:rStyle w:val="aff8"/>
             <w:noProof/>
           </w:rPr>
-          <w:t>1 ЦЕЛЬ РАБОТЫ</w:t>
+          <w:t>1 Цель работы</w:t>
         </w:r>
         <w:r>
           <w:rPr>
@@ -324,7 +333,7 @@
             <w:noProof/>
             <w:webHidden/>
           </w:rPr>
-          <w:instrText xml:space="preserve"> PAGEREF _Toc242426566 \h </w:instrText>
+          <w:instrText xml:space="preserve"> PAGEREF _Toc242612908 \h </w:instrText>
         </w:r>
         <w:r>
           <w:rPr>
@@ -370,13 +379,13 @@
           <w14:ligatures w14:val="standardContextual"/>
         </w:rPr>
       </w:pPr>
-      <w:hyperlink w:anchor="_Toc242426567" w:history="1">
+      <w:hyperlink w:anchor="_Toc242612909" w:history="1">
         <w:r>
           <w:rPr>
             <w:rStyle w:val="aff8"/>
             <w:noProof/>
           </w:rPr>
-          <w:t>2 ТЕОРЕТИЧЕСКИЕ СВЕДЕНИЯ</w:t>
+          <w:t>2 Ход работы</w:t>
         </w:r>
         <w:r>
           <w:rPr>
@@ -397,7 +406,7 @@
             <w:noProof/>
             <w:webHidden/>
           </w:rPr>
-          <w:instrText xml:space="preserve"> PAGEREF _Toc242426567 \h </w:instrText>
+          <w:instrText xml:space="preserve"> PAGEREF _Toc242612909 \h </w:instrText>
         </w:r>
         <w:r>
           <w:rPr>
@@ -430,7 +439,7 @@
     </w:p>
     <w:p>
       <w:pPr>
-        <w:pStyle w:val="14"/>
+        <w:pStyle w:val="2c"/>
         <w:tabs>
           <w:tab w:val="right" w:leader="dot" w:pos="9345"/>
         </w:tabs>
@@ -443,13 +452,13 @@
           <w14:ligatures w14:val="standardContextual"/>
         </w:rPr>
       </w:pPr>
-      <w:hyperlink w:anchor="_Toc242426568" w:history="1">
+      <w:hyperlink w:anchor="_Toc242612910" w:history="1">
         <w:r>
           <w:rPr>
             <w:rStyle w:val="aff8"/>
             <w:noProof/>
           </w:rPr>
-          <w:t>3 ВЫПОЛНЕНИЕ РАБОТЫ</w:t>
+          <w:t>2.1 Постановка задачи</w:t>
         </w:r>
         <w:r>
           <w:rPr>
@@ -470,7 +479,153 @@
             <w:noProof/>
             <w:webHidden/>
           </w:rPr>
-          <w:instrText xml:space="preserve"> PAGEREF _Toc242426568 \h </w:instrText>
+          <w:instrText xml:space="preserve"> PAGEREF _Toc242612910 \h </w:instrText>
+        </w:r>
+        <w:r>
+          <w:rPr>
+            <w:noProof/>
+            <w:webHidden/>
+          </w:rPr>
+        </w:r>
+        <w:r>
+          <w:rPr>
+            <w:noProof/>
+            <w:webHidden/>
+          </w:rPr>
+          <w:fldChar w:fldCharType="separate"/>
+        </w:r>
+        <w:r>
+          <w:rPr>
+            <w:noProof/>
+            <w:webHidden/>
+          </w:rPr>
+          <w:t>4</w:t>
+        </w:r>
+        <w:r>
+          <w:rPr>
+            <w:noProof/>
+            <w:webHidden/>
+          </w:rPr>
+          <w:fldChar w:fldCharType="end"/>
+        </w:r>
+      </w:hyperlink>
+    </w:p>
+    <w:p>
+      <w:pPr>
+        <w:pStyle w:val="2c"/>
+        <w:tabs>
+          <w:tab w:val="right" w:leader="dot" w:pos="9345"/>
+        </w:tabs>
+        <w:rPr>
+          <w:rFonts w:asciiTheme="minorHAnsi" w:eastAsiaTheme="minorEastAsia" w:hAnsiTheme="minorHAnsi"/>
+          <w:noProof/>
+          <w:kern w:val="2"/>
+          <w:sz w:val="24"/>
+          <w:szCs w:val="24"/>
+          <w14:ligatures w14:val="standardContextual"/>
+        </w:rPr>
+      </w:pPr>
+      <w:hyperlink w:anchor="_Toc242612911" w:history="1">
+        <w:r>
+          <w:rPr>
+            <w:rStyle w:val="aff8"/>
+            <w:noProof/>
+          </w:rPr>
+          <w:t>2.2 Теоретические сведения</w:t>
+        </w:r>
+        <w:r>
+          <w:rPr>
+            <w:noProof/>
+            <w:webHidden/>
+          </w:rPr>
+          <w:tab/>
+        </w:r>
+        <w:r>
+          <w:rPr>
+            <w:noProof/>
+            <w:webHidden/>
+          </w:rPr>
+          <w:fldChar w:fldCharType="begin"/>
+        </w:r>
+        <w:r>
+          <w:rPr>
+            <w:noProof/>
+            <w:webHidden/>
+          </w:rPr>
+          <w:instrText xml:space="preserve"> PAGEREF _Toc242612911 \h </w:instrText>
+        </w:r>
+        <w:r>
+          <w:rPr>
+            <w:noProof/>
+            <w:webHidden/>
+          </w:rPr>
+        </w:r>
+        <w:r>
+          <w:rPr>
+            <w:noProof/>
+            <w:webHidden/>
+          </w:rPr>
+          <w:fldChar w:fldCharType="separate"/>
+        </w:r>
+        <w:r>
+          <w:rPr>
+            <w:noProof/>
+            <w:webHidden/>
+          </w:rPr>
+          <w:t>4</w:t>
+        </w:r>
+        <w:r>
+          <w:rPr>
+            <w:noProof/>
+            <w:webHidden/>
+          </w:rPr>
+          <w:fldChar w:fldCharType="end"/>
+        </w:r>
+      </w:hyperlink>
+    </w:p>
+    <w:p>
+      <w:pPr>
+        <w:pStyle w:val="2c"/>
+        <w:tabs>
+          <w:tab w:val="right" w:leader="dot" w:pos="9345"/>
+        </w:tabs>
+        <w:rPr>
+          <w:rFonts w:asciiTheme="minorHAnsi" w:eastAsiaTheme="minorEastAsia" w:hAnsiTheme="minorHAnsi"/>
+          <w:noProof/>
+          <w:kern w:val="2"/>
+          <w:sz w:val="24"/>
+          <w:szCs w:val="24"/>
+          <w14:ligatures w14:val="standardContextual"/>
+        </w:rPr>
+      </w:pPr>
+      <w:hyperlink w:anchor="_Toc242612912" w:history="1">
+        <w:r>
+          <w:rPr>
+            <w:rStyle w:val="aff8"/>
+            <w:noProof/>
+          </w:rPr>
+          <w:t>2.3 Подготовка среды и запуск</w:t>
+        </w:r>
+        <w:r>
+          <w:rPr>
+            <w:noProof/>
+            <w:webHidden/>
+          </w:rPr>
+          <w:tab/>
+        </w:r>
+        <w:r>
+          <w:rPr>
+            <w:noProof/>
+            <w:webHidden/>
+          </w:rPr>
+          <w:fldChar w:fldCharType="begin"/>
+        </w:r>
+        <w:r>
+          <w:rPr>
+            <w:noProof/>
+            <w:webHidden/>
+          </w:rPr>
+          <w:instrText xml:space="preserve"> PAGEREF _Toc242612912 \h </w:instrText>
         </w:r>
         <w:r>
           <w:rPr>
@@ -516,13 +671,13 @@
           <w14:ligatures w14:val="standardContextual"/>
         </w:rPr>
       </w:pPr>
-      <w:hyperlink w:anchor="_Toc242426569" w:history="1">
+      <w:hyperlink w:anchor="_Toc242612913" w:history="1">
         <w:r>
           <w:rPr>
             <w:rStyle w:val="aff8"/>
             <w:noProof/>
           </w:rPr>
-          <w:t>3.1 Подготовка среды и запуск</w:t>
+          <w:t>2.4 Индивидуальное задание</w:t>
         </w:r>
         <w:r>
           <w:rPr>
@@ -543,7 +698,7 @@
             <w:noProof/>
             <w:webHidden/>
           </w:rPr>
-          <w:instrText xml:space="preserve"> PAGEREF _Toc242426569 \h </w:instrText>
+          <w:instrText xml:space="preserve"> PAGEREF _Toc242612913 \h </w:instrText>
         </w:r>
         <w:r>
           <w:rPr>
@@ -589,13 +744,13 @@
           <w14:ligatures w14:val="standardContextual"/>
         </w:rPr>
       </w:pPr>
-      <w:hyperlink w:anchor="_Toc242426570" w:history="1">
+      <w:hyperlink w:anchor="_Toc242612914" w:history="1">
         <w:r>
           <w:rPr>
             <w:rStyle w:val="aff8"/>
             <w:noProof/>
           </w:rPr>
-          <w:t>3.2 Индивидуальное задание</w:t>
+          <w:t>2.5 Результаты работы</w:t>
         </w:r>
         <w:r>
           <w:rPr>
@@ -616,7 +771,7 @@
             <w:noProof/>
             <w:webHidden/>
           </w:rPr>
-          <w:instrText xml:space="preserve"> PAGEREF _Toc242426570 \h </w:instrText>
+          <w:instrText xml:space="preserve"> PAGEREF _Toc242612914 \h </w:instrText>
         </w:r>
         <w:r>
           <w:rPr>
@@ -662,13 +817,13 @@
           <w14:ligatures w14:val="standardContextual"/>
         </w:rPr>
       </w:pPr>
-      <w:hyperlink w:anchor="_Toc242426571" w:history="1">
+      <w:hyperlink w:anchor="_Toc242612915" w:history="1">
         <w:r>
           <w:rPr>
             <w:rStyle w:val="aff8"/>
             <w:noProof/>
           </w:rPr>
-          <w:t>3.3 Результаты работы</w:t>
+          <w:t>2.6 Запуск на нескольких компьютерах</w:t>
         </w:r>
         <w:r>
           <w:rPr>
@@ -689,7 +844,7 @@
             <w:noProof/>
             <w:webHidden/>
           </w:rPr>
-          <w:instrText xml:space="preserve"> PAGEREF _Toc242426571 \h </w:instrText>
+          <w:instrText xml:space="preserve"> PAGEREF _Toc242612915 \h </w:instrText>
         </w:r>
         <w:r>
           <w:rPr>
@@ -722,7 +877,7 @@
     </w:p>
     <w:p>
       <w:pPr>
-        <w:pStyle w:val="2c"/>
+        <w:pStyle w:val="14"/>
         <w:tabs>
           <w:tab w:val="right" w:leader="dot" w:pos="9345"/>
         </w:tabs>
@@ -735,13 +890,13 @@
           <w14:ligatures w14:val="standardContextual"/>
         </w:rPr>
       </w:pPr>
-      <w:hyperlink w:anchor="_Toc242426572" w:history="1">
+      <w:hyperlink w:anchor="_Toc242612916" w:history="1">
         <w:r>
           <w:rPr>
             <w:rStyle w:val="aff8"/>
             <w:noProof/>
           </w:rPr>
-          <w:t>3.4 Запуск на нескольких компьютерах</w:t>
+          <w:t>3 Ответы на контрольные вопросы</w:t>
         </w:r>
         <w:r>
           <w:rPr>
@@ -762,7 +917,7 @@
             <w:noProof/>
             <w:webHidden/>
           </w:rPr>
-          <w:instrText xml:space="preserve"> PAGEREF _Toc242426572 \h </w:instrText>
+          <w:instrText xml:space="preserve"> PAGEREF _Toc242612916 \h </w:instrText>
         </w:r>
         <w:r>
           <w:rPr>
@@ -808,13 +963,13 @@
           <w14:ligatures w14:val="standardContextual"/>
         </w:rPr>
       </w:pPr>
-      <w:hyperlink w:anchor="_Toc242426573" w:history="1">
+      <w:hyperlink w:anchor="_Toc242612917" w:history="1">
         <w:r>
           <w:rPr>
             <w:rStyle w:val="aff8"/>
             <w:noProof/>
           </w:rPr>
-          <w:t>4 КОНТРОЛЬНЫЕ ВОПРОСЫ</w:t>
+          <w:t>Выводы</w:t>
         </w:r>
         <w:r>
           <w:rPr>
@@ -835,7 +990,7 @@
             <w:noProof/>
             <w:webHidden/>
           </w:rPr>
-          <w:instrText xml:space="preserve"> PAGEREF _Toc242426573 \h </w:instrText>
+          <w:instrText xml:space="preserve"> PAGEREF _Toc242612917 \h </w:instrText>
         </w:r>
         <w:r>
           <w:rPr>
@@ -855,7 +1010,7 @@
             <w:noProof/>
             <w:webHidden/>
           </w:rPr>
-          <w:t>17</w:t>
+          <w:t>14</w:t>
         </w:r>
         <w:r>
           <w:rPr>
@@ -868,7 +1023,7 @@
     </w:p>
     <w:p>
       <w:pPr>
-        <w:pStyle w:val="2c"/>
+        <w:pStyle w:val="14"/>
         <w:tabs>
           <w:tab w:val="right" w:leader="dot" w:pos="9345"/>
         </w:tabs>
@@ -881,43 +1036,13 @@
           <w14:ligatures w14:val="standardContextual"/>
         </w:rPr>
       </w:pPr>
-      <w:hyperlink w:anchor="_Toc242426574" w:history="1">
+      <w:hyperlink w:anchor="_Toc242612918" w:history="1">
         <w:r>
           <w:rPr>
             <w:rStyle w:val="aff8"/>
             <w:noProof/>
           </w:rPr>
-          <w:t xml:space="preserve">4.1 Назначение протоколов </w:t>
-        </w:r>
-        <w:r>
-          <w:rPr>
-            <w:rStyle w:val="aff8"/>
-            <w:i/>
-            <w:noProof/>
-          </w:rPr>
-          <w:t>TCP</w:t>
-        </w:r>
-        <w:r>
-          <w:rPr>
-            <w:rStyle w:val="aff8"/>
-            <w:noProof/>
-          </w:rPr>
-          <w:t xml:space="preserve"> и </w:t>
-        </w:r>
-        <w:r>
-          <w:rPr>
-            <w:rStyle w:val="aff8"/>
-            <w:i/>
-            <w:noProof/>
-          </w:rPr>
-          <w:t>UDP</w:t>
-        </w:r>
-        <w:r>
-          <w:rPr>
-            <w:rStyle w:val="aff8"/>
-            <w:noProof/>
-          </w:rPr>
-          <w:t xml:space="preserve"> и их отличие</w:t>
+          <w:t>Приложение А (обязательное) Листинги программного кода</w:t>
         </w:r>
         <w:r>
           <w:rPr>
@@ -938,7 +1063,7 @@
             <w:noProof/>
             <w:webHidden/>
           </w:rPr>
-          <w:instrText xml:space="preserve"> PAGEREF _Toc242426574 \h </w:instrText>
+          <w:instrText xml:space="preserve"> PAGEREF _Toc242612918 \h </w:instrText>
         </w:r>
         <w:r>
           <w:rPr>
@@ -958,7 +1083,7 @@
             <w:noProof/>
             <w:webHidden/>
           </w:rPr>
-          <w:t>17</w:t>
+          <w:t>15</w:t>
         </w:r>
         <w:r>
           <w:rPr>
@@ -970,298 +1095,6 @@
       </w:hyperlink>
     </w:p>
     <w:p>
-      <w:pPr>
-        <w:pStyle w:val="2c"/>
-        <w:tabs>
-          <w:tab w:val="right" w:leader="dot" w:pos="9345"/>
-        </w:tabs>
-        <w:rPr>
-          <w:rFonts w:asciiTheme="minorHAnsi" w:eastAsiaTheme="minorEastAsia" w:hAnsiTheme="minorHAnsi"/>
-          <w:noProof/>
-          <w:kern w:val="2"/>
-          <w:sz w:val="24"/>
-          <w:szCs w:val="24"/>
-          <w14:ligatures w14:val="standardContextual"/>
-        </w:rPr>
-      </w:pPr>
-      <w:hyperlink w:anchor="_Toc242426575" w:history="1">
-        <w:r>
-          <w:rPr>
-            <w:rStyle w:val="aff8"/>
-            <w:noProof/>
-          </w:rPr>
-          <w:t>4.2 Объекты и методы отправки данных по сети</w:t>
-        </w:r>
-        <w:r>
-          <w:rPr>
-            <w:noProof/>
-            <w:webHidden/>
-          </w:rPr>
-          <w:tab/>
-        </w:r>
-        <w:r>
-          <w:rPr>
-            <w:noProof/>
-            <w:webHidden/>
-          </w:rPr>
-          <w:fldChar w:fldCharType="begin"/>
-        </w:r>
-        <w:r>
-          <w:rPr>
-            <w:noProof/>
-            <w:webHidden/>
-          </w:rPr>
-          <w:instrText xml:space="preserve"> PAGEREF _Toc242426575 \h </w:instrText>
-        </w:r>
-        <w:r>
-          <w:rPr>
-            <w:noProof/>
-            <w:webHidden/>
-          </w:rPr>
-        </w:r>
-        <w:r>
-          <w:rPr>
-            <w:noProof/>
-            <w:webHidden/>
-          </w:rPr>
-          <w:fldChar w:fldCharType="separate"/>
-        </w:r>
-        <w:r>
-          <w:rPr>
-            <w:noProof/>
-            <w:webHidden/>
-          </w:rPr>
-          <w:t>17</w:t>
-        </w:r>
-        <w:r>
-          <w:rPr>
-            <w:noProof/>
-            <w:webHidden/>
-          </w:rPr>
-          <w:fldChar w:fldCharType="end"/>
-        </w:r>
-      </w:hyperlink>
-    </w:p>
-    <w:p>
-      <w:pPr>
-        <w:pStyle w:val="2c"/>
-        <w:tabs>
-          <w:tab w:val="right" w:leader="dot" w:pos="9345"/>
-        </w:tabs>
-        <w:rPr>
-          <w:rFonts w:asciiTheme="minorHAnsi" w:eastAsiaTheme="minorEastAsia" w:hAnsiTheme="minorHAnsi"/>
-          <w:noProof/>
-          <w:kern w:val="2"/>
-          <w:sz w:val="24"/>
-          <w:szCs w:val="24"/>
-          <w14:ligatures w14:val="standardContextual"/>
-        </w:rPr>
-      </w:pPr>
-      <w:hyperlink w:anchor="_Toc242426576" w:history="1">
-        <w:r>
-          <w:rPr>
-            <w:rStyle w:val="aff8"/>
-            <w:noProof/>
-          </w:rPr>
-          <w:t>4.3 Пересылка данных в обратном направлении (от клиента к серверу)</w:t>
-        </w:r>
-        <w:r>
-          <w:rPr>
-            <w:noProof/>
-            <w:webHidden/>
-          </w:rPr>
-          <w:tab/>
-        </w:r>
-        <w:r>
-          <w:rPr>
-            <w:noProof/>
-            <w:webHidden/>
-          </w:rPr>
-          <w:fldChar w:fldCharType="begin"/>
-        </w:r>
-        <w:r>
-          <w:rPr>
-            <w:noProof/>
-            <w:webHidden/>
-          </w:rPr>
-          <w:instrText xml:space="preserve"> PAGEREF _Toc242426576 \h </w:instrText>
-        </w:r>
-        <w:r>
-          <w:rPr>
-            <w:noProof/>
-            <w:webHidden/>
-          </w:rPr>
-        </w:r>
-        <w:r>
-          <w:rPr>
-            <w:noProof/>
-            <w:webHidden/>
-          </w:rPr>
-          <w:fldChar w:fldCharType="separate"/>
-        </w:r>
-        <w:r>
-          <w:rPr>
-            <w:noProof/>
-            <w:webHidden/>
-          </w:rPr>
-          <w:t>17</w:t>
-        </w:r>
-        <w:r>
-          <w:rPr>
-            <w:noProof/>
-            <w:webHidden/>
-          </w:rPr>
-          <w:fldChar w:fldCharType="end"/>
-        </w:r>
-      </w:hyperlink>
-    </w:p>
-    <w:p>
-      <w:pPr>
-        <w:pStyle w:val="2c"/>
-        <w:tabs>
-          <w:tab w:val="right" w:leader="dot" w:pos="9345"/>
-        </w:tabs>
-        <w:rPr>
-          <w:rFonts w:asciiTheme="minorHAnsi" w:eastAsiaTheme="minorEastAsia" w:hAnsiTheme="minorHAnsi"/>
-          <w:noProof/>
-          <w:kern w:val="2"/>
-          <w:sz w:val="24"/>
-          <w:szCs w:val="24"/>
-          <w14:ligatures w14:val="standardContextual"/>
-        </w:rPr>
-      </w:pPr>
-      <w:hyperlink w:anchor="_Toc242426577" w:history="1">
-        <w:r>
-          <w:rPr>
-            <w:rStyle w:val="aff8"/>
-            <w:noProof/>
-          </w:rPr>
-          <w:t>4.4 Как определить сетевой адрес своего компьютера</w:t>
-        </w:r>
-        <w:r>
-          <w:rPr>
-            <w:noProof/>
-            <w:webHidden/>
-          </w:rPr>
-          <w:tab/>
-        </w:r>
-        <w:r>
-          <w:rPr>
-            <w:noProof/>
-            <w:webHidden/>
-          </w:rPr>
-          <w:fldChar w:fldCharType="begin"/>
-        </w:r>
-        <w:r>
-          <w:rPr>
-            <w:noProof/>
-            <w:webHidden/>
-          </w:rPr>
-          <w:instrText xml:space="preserve"> PAGEREF _Toc242426577 \h </w:instrText>
-        </w:r>
-        <w:r>
-          <w:rPr>
-            <w:noProof/>
-            <w:webHidden/>
-          </w:rPr>
-        </w:r>
-        <w:r>
-          <w:rPr>
-            <w:noProof/>
-            <w:webHidden/>
-          </w:rPr>
-          <w:fldChar w:fldCharType="separate"/>
-        </w:r>
-        <w:r>
-          <w:rPr>
-            <w:noProof/>
-            <w:webHidden/>
-          </w:rPr>
-          <w:t>17</w:t>
-        </w:r>
-        <w:r>
-          <w:rPr>
-            <w:noProof/>
-            <w:webHidden/>
-          </w:rPr>
-          <w:fldChar w:fldCharType="end"/>
-        </w:r>
-      </w:hyperlink>
-    </w:p>
-    <w:p>
-      <w:pPr>
-        <w:pStyle w:val="14"/>
-        <w:tabs>
-          <w:tab w:val="right" w:leader="dot" w:pos="9345"/>
-        </w:tabs>
-        <w:rPr>
-          <w:rFonts w:asciiTheme="minorHAnsi" w:eastAsiaTheme="minorEastAsia" w:hAnsiTheme="minorHAnsi"/>
-          <w:noProof/>
-          <w:kern w:val="2"/>
-          <w:sz w:val="24"/>
-          <w:szCs w:val="24"/>
-          <w14:ligatures w14:val="standardContextual"/>
-        </w:rPr>
-      </w:pPr>
-      <w:hyperlink w:anchor="_Toc242426578" w:history="1">
-        <w:r>
-          <w:rPr>
-            <w:rStyle w:val="aff8"/>
-            <w:noProof/>
-          </w:rPr>
-          <w:t>ЗАКЛЮЧЕНИЕ</w:t>
-        </w:r>
-        <w:r>
-          <w:rPr>
-            <w:noProof/>
-            <w:webHidden/>
-          </w:rPr>
-          <w:tab/>
-        </w:r>
-        <w:r>
-          <w:rPr>
-            <w:noProof/>
-            <w:webHidden/>
-          </w:rPr>
-          <w:fldChar w:fldCharType="begin"/>
-        </w:r>
-        <w:r>
-          <w:rPr>
-            <w:noProof/>
-            <w:webHidden/>
-          </w:rPr>
-          <w:instrText xml:space="preserve"> PAGEREF _Toc242426578 \h </w:instrText>
-        </w:r>
-        <w:r>
-          <w:rPr>
-            <w:noProof/>
-            <w:webHidden/>
-          </w:rPr>
-        </w:r>
-        <w:r>
-          <w:rPr>
-            <w:noProof/>
-            <w:webHidden/>
-          </w:rPr>
-          <w:fldChar w:fldCharType="separate"/>
-        </w:r>
-        <w:r>
-          <w:rPr>
-            <w:noProof/>
-            <w:webHidden/>
-          </w:rPr>
-          <w:t>18</w:t>
-        </w:r>
-        <w:r>
-          <w:rPr>
-            <w:noProof/>
-            <w:webHidden/>
-          </w:rPr>
-          <w:fldChar w:fldCharType="end"/>
-        </w:r>
-      </w:hyperlink>
-    </w:p>
-    <w:p>
       <w:r>
         <w:fldChar w:fldCharType="end"/>
       </w:r>
@@ -1276,13 +1109,13 @@
         <w:pStyle w:val="1"/>
         <w:ind w:firstLine="709"/>
       </w:pPr>
-      <w:bookmarkStart w:id="0" w:name="_Toc242426566"/>
+      <w:bookmarkStart w:id="0" w:name="_Toc242612908"/>
       <w:r>
         <w:rPr>
           <w:rFonts w:ascii="Times New Roman" w:hAnsi="Times New Roman"/>
         </w:rPr>
         <w:lastRenderedPageBreak/>
-        <w:t>1 ЦЕЛЬ РАБОТЫ</w:t>
+        <w:t>1 Цель работы</w:t>
       </w:r>
       <w:bookmarkEnd w:id="0"/>
     </w:p>
@@ -1292,7 +1125,7 @@
         <w:jc w:val="both"/>
       </w:pPr>
       <w:r>
-        <w:t xml:space="preserve">Познакомиться с техникой использования сокетных классов </w:t>
+        <w:t xml:space="preserve">Изучить работу на основе сокетных соединений в языке </w:t>
       </w:r>
       <w:r>
         <w:rPr>
@@ -1301,7 +1134,7 @@
         <w:t>Java</w:t>
       </w:r>
       <w:r>
-        <w:t>.</w:t>
+        <w:t>: создание серверного сокета, подключение клиентов, обмен текстовыми сообщениями и организацию клиентов в виде отдельных потоков. Научиться запускать сервер и клиентов на разных компьютерах одной сети, настраивая адрес сервера при запуске, и выполнять индивидуальное задание варианта 2 – работу с общим счетом из двух клиентов.</w:t>
       </w:r>
     </w:p>
     <w:p>
@@ -1314,15 +1147,135 @@
         <w:pStyle w:val="1"/>
         <w:ind w:firstLine="709"/>
       </w:pPr>
-      <w:bookmarkStart w:id="1" w:name="_Toc242426567"/>
+      <w:bookmarkStart w:id="1" w:name="_Toc242612909"/>
       <w:r>
         <w:rPr>
           <w:rFonts w:ascii="Times New Roman" w:hAnsi="Times New Roman"/>
         </w:rPr>
         <w:lastRenderedPageBreak/>
-        <w:t>2 ТЕОРЕТИЧЕСКИЕ СВЕДЕНИЯ</w:t>
+        <w:t>2 Ход работы</w:t>
       </w:r>
       <w:bookmarkEnd w:id="1"/>
+    </w:p>
+    <w:p>
+      <w:pPr>
+        <w:ind w:firstLine="709"/>
+        <w:jc w:val="both"/>
+      </w:pPr>
+      <w:r>
+        <w:t xml:space="preserve">Работа выполнена на языке </w:t>
+      </w:r>
+      <w:r>
+        <w:rPr>
+          <w:i/>
+        </w:rPr>
+        <w:t>Java</w:t>
+      </w:r>
+      <w:r>
+        <w:t xml:space="preserve"> 17 с использованием библиотеки </w:t>
+      </w:r>
+      <w:r>
+        <w:rPr>
+          <w:i/>
+        </w:rPr>
+        <w:t>AWT</w:t>
+      </w:r>
+      <w:r>
+        <w:t xml:space="preserve"> и пакета </w:t>
+      </w:r>
+      <w:r>
+        <w:rPr>
+          <w:i/>
+        </w:rPr>
+        <w:t>java.net</w:t>
+      </w:r>
+      <w:r>
+        <w:t>. Полный текст программы приведен в приложении А. Ниже последовательно описаны постановка задачи, теоретическая основа, реализация заданий и результаты проверки.</w:t>
+      </w:r>
+    </w:p>
+    <w:p>
+      <w:pPr>
+        <w:pStyle w:val="21"/>
+        <w:spacing w:before="360"/>
+        <w:ind w:firstLine="709"/>
+      </w:pPr>
+      <w:bookmarkStart w:id="2" w:name="_Toc242612910"/>
+      <w:r>
+        <w:rPr>
+          <w:rFonts w:ascii="Times New Roman" w:hAnsi="Times New Roman"/>
+        </w:rPr>
+        <w:t>2.1 Постановка задачи</w:t>
+      </w:r>
+      <w:bookmarkEnd w:id="2"/>
+    </w:p>
+    <w:p>
+      <w:pPr>
+        <w:ind w:firstLine="709"/>
+        <w:jc w:val="both"/>
+      </w:pPr>
+      <w:r>
+        <w:t>Для изучения сокетных соединений в рамках работы требуется выполнить следующие задачи:</w:t>
+      </w:r>
+    </w:p>
+    <w:p>
+      <w:pPr>
+        <w:ind w:firstLine="709"/>
+        <w:jc w:val="both"/>
+      </w:pPr>
+      <w:r>
+        <w:t>1 реализовать сервер, принимающий подключения клиентов по сокету;</w:t>
+      </w:r>
+    </w:p>
+    <w:p>
+      <w:pPr>
+        <w:ind w:firstLine="709"/>
+        <w:jc w:val="both"/>
+      </w:pPr>
+      <w:r>
+        <w:t>2 реализовать клиентов в виде потоков, отправляющих команды серверу и получающих ответ;</w:t>
+      </w:r>
+    </w:p>
+    <w:p>
+      <w:pPr>
+        <w:ind w:firstLine="709"/>
+        <w:jc w:val="both"/>
+      </w:pPr>
+      <w:r>
+        <w:t>3 выполнить индивидуальное задание варианта 2: два клиента пополняют и снимают средства со счета на сервере;</w:t>
+      </w:r>
+    </w:p>
+    <w:p>
+      <w:pPr>
+        <w:ind w:firstLine="709"/>
+        <w:jc w:val="both"/>
+      </w:pPr>
+      <w:r>
+        <w:t>4 обеспечить запуск сервера и клиентов на разных компьютерах с указанием адреса сервера;</w:t>
+      </w:r>
+    </w:p>
+    <w:p>
+      <w:pPr>
+        <w:ind w:firstLine="709"/>
+        <w:jc w:val="both"/>
+      </w:pPr>
+      <w:r>
+        <w:t>5 проверить работу в сети с клиентами на другом компьютере и в виртуальной машине.</w:t>
+      </w:r>
+    </w:p>
+    <w:p>
+      <w:pPr>
+        <w:pStyle w:val="21"/>
+        <w:spacing w:before="360"/>
+        <w:ind w:firstLine="709"/>
+      </w:pPr>
+      <w:bookmarkStart w:id="3" w:name="_Toc242612911"/>
+      <w:r>
+        <w:rPr>
+          <w:rFonts w:ascii="Times New Roman" w:hAnsi="Times New Roman"/>
+        </w:rPr>
+        <w:t>2.2 Теоретические сведения</w:t>
+      </w:r>
+      <w:bookmarkEnd w:id="3"/>
     </w:p>
     <w:p>
       <w:pPr>
@@ -1402,7 +1355,10 @@
         <w:t>accept</w:t>
       </w:r>
       <w:r>
-        <w:t xml:space="preserve">() блокирует поток до подключения клиента и возвращает объект </w:t>
+        <w:t>()</w:t>
+      </w:r>
+      <w:r>
+        <w:t xml:space="preserve"> блокирует поток до подключения клиента и возвращает объект </w:t>
       </w:r>
       <w:r>
         <w:rPr>
@@ -1420,7 +1376,10 @@
         <w:t>Socket</w:t>
       </w:r>
       <w:r>
-        <w:t xml:space="preserve">("127.0.0.1", порт), где 127.0.0.1 – адрес локального компьютера. Сервер отправляет текст через </w:t>
+        <w:t>("127.0.0.1", порт)</w:t>
+      </w:r>
+      <w:r>
+        <w:t xml:space="preserve">, где 127.0.0.1 – адрес локального компьютера. Сервер отправляет текст через </w:t>
       </w:r>
       <w:r>
         <w:rPr>
@@ -1465,7 +1424,10 @@
         <w:t>readLine</w:t>
       </w:r>
       <w:r>
-        <w:t xml:space="preserve">(). Каждый поток реализуется классом, наследующим </w:t>
+        <w:t>()</w:t>
+      </w:r>
+      <w:r>
+        <w:t xml:space="preserve">. Каждый поток реализуется классом, наследующим </w:t>
       </w:r>
       <w:r>
         <w:rPr>
@@ -1496,39 +1458,20 @@
       </w:r>
     </w:p>
     <w:p>
-      <w:r>
-        <w:br w:type="page"/>
-      </w:r>
-    </w:p>
-    <w:p>
-      <w:pPr>
-        <w:pStyle w:val="1"/>
+      <w:pPr>
+        <w:pStyle w:val="21"/>
+        <w:spacing w:before="360"/>
         <w:ind w:firstLine="709"/>
       </w:pPr>
-      <w:bookmarkStart w:id="2" w:name="_Toc242426568"/>
+      <w:bookmarkStart w:id="4" w:name="_Toc242612912"/>
       <w:r>
         <w:rPr>
           <w:rFonts w:ascii="Times New Roman" w:hAnsi="Times New Roman"/>
         </w:rPr>
         <w:lastRenderedPageBreak/>
-        <w:t>3 ВЫПОЛНЕНИЕ РАБОТЫ</w:t>
-      </w:r>
-      <w:bookmarkEnd w:id="2"/>
-    </w:p>
-    <w:p>
-      <w:pPr>
-        <w:pStyle w:val="21"/>
-        <w:spacing w:before="360"/>
-        <w:ind w:firstLine="709"/>
-      </w:pPr>
-      <w:bookmarkStart w:id="3" w:name="_Toc242426569"/>
-      <w:r>
-        <w:rPr>
-          <w:rFonts w:ascii="Times New Roman" w:hAnsi="Times New Roman"/>
-        </w:rPr>
-        <w:t>3.1 Подготовка среды и запуск</w:t>
-      </w:r>
-      <w:bookmarkEnd w:id="3"/>
+        <w:t>2.3 Подготовка среды и запуск</w:t>
+      </w:r>
+      <w:bookmarkEnd w:id="4"/>
     </w:p>
     <w:p>
       <w:pPr>
@@ -1653,7 +1596,10 @@
         <w:t>DataInputStream.readLine</w:t>
       </w:r>
       <w:r>
-        <w:t>(), при компиляции они выдают предупреждения об устаревших методах, но работают.</w:t>
+        <w:t>()</w:t>
+      </w:r>
+      <w:r>
+        <w:t>, при компиляции они выдают предупреждения об устаревших методах, но работают.</w:t>
       </w:r>
     </w:p>
     <w:p>
@@ -1662,14 +1608,14 @@
         <w:spacing w:before="360"/>
         <w:ind w:firstLine="709"/>
       </w:pPr>
-      <w:bookmarkStart w:id="4" w:name="_Toc242426570"/>
+      <w:bookmarkStart w:id="5" w:name="_Toc242612913"/>
       <w:r>
         <w:rPr>
           <w:rFonts w:ascii="Times New Roman" w:hAnsi="Times New Roman"/>
         </w:rPr>
-        <w:t>3.2 Индивидуальное задание</w:t>
-      </w:r>
-      <w:bookmarkEnd w:id="4"/>
+        <w:t>2.4 Индивидуальное задание</w:t>
+      </w:r>
+      <w:bookmarkEnd w:id="5"/>
     </w:p>
     <w:p>
       <w:pPr>
@@ -1704,7 +1650,10 @@
         <w:t>static int amount</w:t>
       </w:r>
       <w:r>
-        <w:t xml:space="preserve"> = 200, слушает порт 3001 и записывает в журнал окна каждый запрос (откуда пришел и каким стал счет). Клиентский поток </w:t>
+        <w:t xml:space="preserve"> = 200</w:t>
+      </w:r>
+      <w:r>
+        <w:t xml:space="preserve">, слушает порт 3001 и записывает в журнал окна каждый запрос (откуда пришел и каким стал счет). Клиентский поток </w:t>
       </w:r>
       <w:r>
         <w:rPr>
@@ -1740,7 +1689,13 @@
         <w:t>Account</w:t>
       </w:r>
       <w:r>
-        <w:t>:&lt;сумма&gt; и передает его окну. Размер операции генерируется на сервере случайно: (</w:t>
+        <w:t>:&lt;сумма&gt;</w:t>
+      </w:r>
+      <w:r>
+        <w:t xml:space="preserve"> и передает его окну. Размер операции генерируется на сервере случайно: </w:t>
+      </w:r>
+      <w:r>
+        <w:t>(</w:t>
       </w:r>
       <w:r>
         <w:rPr>
@@ -1758,7 +1713,10 @@
         <w:t>Math.random</w:t>
       </w:r>
       <w:r>
-        <w:t xml:space="preserve">() * 1000). Окно </w:t>
+        <w:t>() * 1000)</w:t>
+      </w:r>
+      <w:r>
+        <w:t xml:space="preserve">. Окно </w:t>
       </w:r>
       <w:r>
         <w:rPr>
@@ -1772,399 +1730,6 @@
     </w:p>
     <w:p>
       <w:pPr>
-        <w:keepNext/>
-        <w:ind w:firstLine="709"/>
-        <w:jc w:val="both"/>
-      </w:pPr>
-      <w:r>
-        <w:t xml:space="preserve">Листинг 3.1 – Серверный поток </w:t>
-      </w:r>
-      <w:r>
-        <w:rPr>
-          <w:i/>
-        </w:rPr>
-        <w:t>Account</w:t>
-      </w:r>
-    </w:p>
-    <w:p>
-      <w:pPr>
-        <w:pStyle w:val="Listing"/>
-      </w:pPr>
-      <w:r>
-        <w:t>// Серверный поток: хранит счёт и обрабатывает запросы клиентов</w:t>
-      </w:r>
-    </w:p>
-    <w:p>
-      <w:pPr>
-        <w:pStyle w:val="Listing"/>
-      </w:pPr>
-      <w:r>
-        <w:t>class Account extends Thread {</w:t>
-      </w:r>
-    </w:p>
-    <w:p>
-      <w:pPr>
-        <w:pStyle w:val="Listing"/>
-      </w:pPr>
-      <w:r>
-        <w:t xml:space="preserve">    ServerSocket server;</w:t>
-      </w:r>
-    </w:p>
-    <w:p>
-      <w:pPr>
-        <w:pStyle w:val="Listing"/>
-      </w:pPr>
-      <w:r>
-        <w:t xml:space="preserve">    String amountstring;</w:t>
-      </w:r>
-    </w:p>
-    <w:p>
-      <w:pPr>
-        <w:pStyle w:val="Listing"/>
-      </w:pPr>
-      <w:r>
-        <w:t xml:space="preserve">    static int amount = 200;</w:t>
-      </w:r>
-    </w:p>
-    <w:p>
-      <w:pPr>
-        <w:pStyle w:val="Listing"/>
-      </w:pPr>
-      <w:r>
-        <w:t xml:space="preserve">    serv window; // окно, в журнал которого сервер записывает запросы</w:t>
-      </w:r>
-    </w:p>
-    <w:p>
-      <w:pPr>
-        <w:pStyle w:val="Listing"/>
-      </w:pPr>
-    </w:p>
-    <w:p>
-      <w:pPr>
-        <w:pStyle w:val="Listing"/>
-      </w:pPr>
-      <w:r>
-        <w:t xml:space="preserve">    public Account(serv window) {</w:t>
-      </w:r>
-    </w:p>
-    <w:p>
-      <w:pPr>
-        <w:pStyle w:val="Listing"/>
-      </w:pPr>
-      <w:r>
-        <w:t xml:space="preserve">        this.window = window;</w:t>
-      </w:r>
-    </w:p>
-    <w:p>
-      <w:pPr>
-        <w:pStyle w:val="Listing"/>
-      </w:pPr>
-      <w:r>
-        <w:t xml:space="preserve">    }</w:t>
-      </w:r>
-    </w:p>
-    <w:p>
-      <w:pPr>
-        <w:pStyle w:val="Listing"/>
-      </w:pPr>
-    </w:p>
-    <w:p>
-      <w:pPr>
-        <w:pStyle w:val="Listing"/>
-      </w:pPr>
-      <w:r>
-        <w:t xml:space="preserve">    public void run() {</w:t>
-      </w:r>
-    </w:p>
-    <w:p>
-      <w:pPr>
-        <w:pStyle w:val="Listing"/>
-      </w:pPr>
-      <w:r>
-        <w:lastRenderedPageBreak/>
-        <w:t xml:space="preserve">        try {</w:t>
-      </w:r>
-    </w:p>
-    <w:p>
-      <w:pPr>
-        <w:pStyle w:val="Listing"/>
-      </w:pPr>
-      <w:r>
-        <w:t xml:space="preserve">            server = new ServerSocket(3001); // Номер сокета</w:t>
-      </w:r>
-    </w:p>
-    <w:p>
-      <w:pPr>
-        <w:pStyle w:val="Listing"/>
-      </w:pPr>
-      <w:r>
-        <w:t xml:space="preserve">        } catch (Exception e) {</w:t>
-      </w:r>
-    </w:p>
-    <w:p>
-      <w:pPr>
-        <w:pStyle w:val="Listing"/>
-      </w:pPr>
-      <w:r>
-        <w:t xml:space="preserve">            System.out.println("Ошибка соединения+" + e);</w:t>
-      </w:r>
-    </w:p>
-    <w:p>
-      <w:pPr>
-        <w:pStyle w:val="Listing"/>
-      </w:pPr>
-      <w:r>
-        <w:t xml:space="preserve">        }</w:t>
-      </w:r>
-    </w:p>
-    <w:p>
-      <w:pPr>
-        <w:pStyle w:val="Listing"/>
-      </w:pPr>
-      <w:r>
-        <w:t xml:space="preserve">        while (true) {</w:t>
-      </w:r>
-    </w:p>
-    <w:p>
-      <w:pPr>
-        <w:pStyle w:val="Listing"/>
-      </w:pPr>
-      <w:r>
-        <w:t xml:space="preserve">            Socket s = null;</w:t>
-      </w:r>
-    </w:p>
-    <w:p>
-      <w:pPr>
-        <w:pStyle w:val="Listing"/>
-      </w:pPr>
-      <w:r>
-        <w:t xml:space="preserve">            try {</w:t>
-      </w:r>
-    </w:p>
-    <w:p>
-      <w:pPr>
-        <w:pStyle w:val="Listing"/>
-      </w:pPr>
-      <w:r>
-        <w:t xml:space="preserve">                s = server.accept(); // ожидание соединения с клиентом</w:t>
-      </w:r>
-    </w:p>
-    <w:p>
-      <w:pPr>
-        <w:pStyle w:val="Listing"/>
-      </w:pPr>
-      <w:r>
-        <w:t xml:space="preserve">            } catch (Exception e) {</w:t>
-      </w:r>
-    </w:p>
-    <w:p>
-      <w:pPr>
-        <w:pStyle w:val="Listing"/>
-      </w:pPr>
-      <w:r>
-        <w:t xml:space="preserve">                System.out.println("Ошибка" + e);</w:t>
-      </w:r>
-    </w:p>
-    <w:p>
-      <w:pPr>
-        <w:pStyle w:val="Listing"/>
-      </w:pPr>
-      <w:r>
-        <w:t xml:space="preserve">            }</w:t>
-      </w:r>
-    </w:p>
-    <w:p>
-      <w:pPr>
-        <w:pStyle w:val="Listing"/>
-      </w:pPr>
-      <w:r>
-        <w:t xml:space="preserve">            try {</w:t>
-      </w:r>
-    </w:p>
-    <w:p>
-      <w:pPr>
-        <w:pStyle w:val="Listing"/>
-      </w:pPr>
-      <w:r>
-        <w:t xml:space="preserve">                // Чтение запроса клиента (ADD или WITHDRAW)</w:t>
-      </w:r>
-    </w:p>
-    <w:p>
-      <w:pPr>
-        <w:pStyle w:val="Listing"/>
-      </w:pPr>
-      <w:r>
-        <w:t xml:space="preserve">                BufferedReader in = new BufferedReader(new InputStreamReader(s.getInputStream()));</w:t>
-      </w:r>
-    </w:p>
-    <w:p>
-      <w:pPr>
-        <w:pStyle w:val="Listing"/>
-      </w:pPr>
-      <w:r>
-        <w:t xml:space="preserve">                String request = in.readLine();</w:t>
-      </w:r>
-    </w:p>
-    <w:p>
-      <w:pPr>
-        <w:pStyle w:val="Listing"/>
-      </w:pPr>
-    </w:p>
-    <w:p>
-      <w:pPr>
-        <w:pStyle w:val="Listing"/>
-      </w:pPr>
-      <w:r>
-        <w:t xml:space="preserve">                PrintStream ps = new PrintStream(s.getOutputStream()); // PrintStream предназначен для текстового вывода</w:t>
-      </w:r>
-    </w:p>
-    <w:p>
-      <w:pPr>
-        <w:pStyle w:val="Listing"/>
-      </w:pPr>
-      <w:r>
-        <w:t xml:space="preserve">                int amountcur = ((int) (Math.random() * 1000));</w:t>
-      </w:r>
-    </w:p>
-    <w:p>
-      <w:pPr>
-        <w:pStyle w:val="Listing"/>
-      </w:pPr>
-      <w:r>
-        <w:t xml:space="preserve">                if (request.equals("ADD"))</w:t>
-      </w:r>
-    </w:p>
-    <w:p>
-      <w:pPr>
-        <w:pStyle w:val="Listing"/>
-      </w:pPr>
-      <w:r>
-        <w:t xml:space="preserve">                    amount += amountcur;</w:t>
-      </w:r>
-    </w:p>
-    <w:p>
-      <w:pPr>
-        <w:pStyle w:val="Listing"/>
-      </w:pPr>
-      <w:r>
-        <w:t xml:space="preserve">                else</w:t>
-      </w:r>
-    </w:p>
-    <w:p>
-      <w:pPr>
-        <w:pStyle w:val="Listing"/>
-      </w:pPr>
-      <w:r>
-        <w:t xml:space="preserve">                    amount -= amountcur;</w:t>
-      </w:r>
-    </w:p>
-    <w:p>
-      <w:pPr>
-        <w:pStyle w:val="Listing"/>
-      </w:pPr>
-      <w:r>
-        <w:t xml:space="preserve">                amountstring = Integer.toString(amount);</w:t>
-      </w:r>
-    </w:p>
-    <w:p>
-      <w:pPr>
-        <w:pStyle w:val="Listing"/>
-      </w:pPr>
-      <w:r>
-        <w:t xml:space="preserve">                ps.println("Account:" + amountstring); // передача строки клиенту</w:t>
-      </w:r>
-    </w:p>
-    <w:p>
-      <w:pPr>
-        <w:pStyle w:val="Listing"/>
-      </w:pPr>
-      <w:r>
-        <w:t xml:space="preserve">                ps.flush();</w:t>
-      </w:r>
-    </w:p>
-    <w:p>
-      <w:pPr>
-        <w:pStyle w:val="Listing"/>
-      </w:pPr>
-      <w:r>
-        <w:t xml:space="preserve">                // Запись в журнал сервера: откуда пришёл запрос и каким стал счёт</w:t>
-      </w:r>
-    </w:p>
-    <w:p>
-      <w:pPr>
-        <w:pStyle w:val="Listing"/>
-      </w:pPr>
-      <w:r>
-        <w:t xml:space="preserve">                window.log.append("[сервер] " + request + " от " + s.getInetAddress().getHostAddress() + ", счёт: " + amountstring + "\n");</w:t>
-      </w:r>
-    </w:p>
-    <w:p>
-      <w:pPr>
-        <w:pStyle w:val="Listing"/>
-      </w:pPr>
-      <w:r>
-        <w:t xml:space="preserve">                window.accountField.setText(amountstring);</w:t>
-      </w:r>
-    </w:p>
-    <w:p>
-      <w:pPr>
-        <w:pStyle w:val="Listing"/>
-      </w:pPr>
-      <w:r>
-        <w:t xml:space="preserve">                s.close(); // Сокетное соединение закрывается</w:t>
-      </w:r>
-    </w:p>
-    <w:p>
-      <w:pPr>
-        <w:pStyle w:val="Listing"/>
-      </w:pPr>
-      <w:r>
-        <w:t xml:space="preserve">            } catch (Exception e) {</w:t>
-      </w:r>
-    </w:p>
-    <w:p>
-      <w:pPr>
-        <w:pStyle w:val="Listing"/>
-      </w:pPr>
-      <w:r>
-        <w:t xml:space="preserve">                System.out.println("Ошибка  " + e);</w:t>
-      </w:r>
-    </w:p>
-    <w:p>
-      <w:pPr>
-        <w:pStyle w:val="Listing"/>
-      </w:pPr>
-      <w:r>
-        <w:t xml:space="preserve">            }</w:t>
-      </w:r>
-    </w:p>
-    <w:p>
-      <w:pPr>
-        <w:pStyle w:val="Listing"/>
-      </w:pPr>
-      <w:r>
-        <w:t xml:space="preserve">        }</w:t>
-      </w:r>
-    </w:p>
-    <w:p>
-      <w:pPr>
-        <w:pStyle w:val="Listing"/>
-      </w:pPr>
-      <w:r>
-        <w:t xml:space="preserve">    }</w:t>
-      </w:r>
-    </w:p>
-    <w:p>
-      <w:pPr>
-        <w:pStyle w:val="Listing"/>
-      </w:pPr>
-      <w:r>
-        <w:t>}</w:t>
-      </w:r>
-    </w:p>
-    <w:p/>
-    <w:p>
-      <w:pPr>
         <w:ind w:firstLine="709"/>
         <w:jc w:val="both"/>
       </w:pPr>
@@ -2178,370 +1743,9 @@
         <w:t>BufferedReader</w:t>
       </w:r>
       <w:r>
-        <w:t xml:space="preserve"> (пересылка данных от клиента к серверу), изменяет счет и отправляет ответ клиенту. Код клиентского потока приведен в листинге.</w:t>
-      </w:r>
-    </w:p>
-    <w:p>
-      <w:pPr>
-        <w:keepNext/>
-        <w:ind w:firstLine="709"/>
-        <w:jc w:val="both"/>
-      </w:pPr>
-      <w:r>
-        <w:t xml:space="preserve">Листинг 3.2 – Клиентский поток </w:t>
-      </w:r>
-      <w:r>
-        <w:rPr>
-          <w:i/>
-        </w:rPr>
-        <w:t>clientThread</w:t>
-      </w:r>
-    </w:p>
-    <w:p>
-      <w:pPr>
-        <w:pStyle w:val="Listing"/>
-      </w:pPr>
-      <w:r>
-        <w:t>// Клиентский поток: отправляет запрос серверу и читает ответ</w:t>
-      </w:r>
-    </w:p>
-    <w:p>
-      <w:pPr>
-        <w:pStyle w:val="Listing"/>
-      </w:pPr>
-      <w:r>
-        <w:t>class clientThread extends Thread {</w:t>
-      </w:r>
-    </w:p>
-    <w:p>
-      <w:pPr>
-        <w:pStyle w:val="Listing"/>
-      </w:pPr>
-      <w:r>
-        <w:t xml:space="preserve">    DataInputStream dis = null;</w:t>
-      </w:r>
-    </w:p>
-    <w:p>
-      <w:pPr>
-        <w:pStyle w:val="Listing"/>
-      </w:pPr>
-      <w:r>
-        <w:t xml:space="preserve">    Socket s = null;</w:t>
-      </w:r>
-    </w:p>
-    <w:p>
-      <w:pPr>
-        <w:pStyle w:val="Listing"/>
-      </w:pPr>
-      <w:r>
-        <w:t xml:space="preserve">    String name;</w:t>
-      </w:r>
-    </w:p>
-    <w:p>
-      <w:pPr>
-        <w:pStyle w:val="Listing"/>
-      </w:pPr>
-      <w:r>
-        <w:lastRenderedPageBreak/>
-        <w:t xml:space="preserve">    String request;</w:t>
-      </w:r>
-    </w:p>
-    <w:p>
-      <w:pPr>
-        <w:pStyle w:val="Listing"/>
-      </w:pPr>
-      <w:r>
-        <w:t xml:space="preserve">    String host;</w:t>
-      </w:r>
-    </w:p>
-    <w:p>
-      <w:pPr>
-        <w:pStyle w:val="Listing"/>
-      </w:pPr>
-      <w:r>
-        <w:t xml:space="preserve">    serv window;</w:t>
-      </w:r>
-    </w:p>
-    <w:p>
-      <w:pPr>
-        <w:pStyle w:val="Listing"/>
-      </w:pPr>
-    </w:p>
-    <w:p>
-      <w:pPr>
-        <w:pStyle w:val="Listing"/>
-      </w:pPr>
-      <w:r>
-        <w:t xml:space="preserve">    public clientThread(String name, String request, serv window, String host) {</w:t>
-      </w:r>
-    </w:p>
-    <w:p>
-      <w:pPr>
-        <w:pStyle w:val="Listing"/>
-      </w:pPr>
-      <w:r>
-        <w:t xml:space="preserve">        this.name = name;</w:t>
-      </w:r>
-    </w:p>
-    <w:p>
-      <w:pPr>
-        <w:pStyle w:val="Listing"/>
-      </w:pPr>
-      <w:r>
-        <w:t xml:space="preserve">        this.request = request;</w:t>
-      </w:r>
-    </w:p>
-    <w:p>
-      <w:pPr>
-        <w:pStyle w:val="Listing"/>
-      </w:pPr>
-      <w:r>
-        <w:t xml:space="preserve">        this.window = window;</w:t>
-      </w:r>
-    </w:p>
-    <w:p>
-      <w:pPr>
-        <w:pStyle w:val="Listing"/>
-      </w:pPr>
-      <w:r>
-        <w:t xml:space="preserve">        this.host = host;</w:t>
-      </w:r>
-    </w:p>
-    <w:p>
-      <w:pPr>
-        <w:pStyle w:val="Listing"/>
-      </w:pPr>
-      <w:r>
-        <w:t xml:space="preserve">        try {</w:t>
-      </w:r>
-    </w:p>
-    <w:p>
-      <w:pPr>
-        <w:pStyle w:val="Listing"/>
-      </w:pPr>
-      <w:r>
-        <w:t xml:space="preserve">            s = new Socket(host, 3001);</w:t>
-      </w:r>
-    </w:p>
-    <w:p>
-      <w:pPr>
-        <w:pStyle w:val="Listing"/>
-      </w:pPr>
-      <w:r>
-        <w:t xml:space="preserve">            dis = new DataInputStream(s.getInputStream());</w:t>
-      </w:r>
-    </w:p>
-    <w:p>
-      <w:pPr>
-        <w:pStyle w:val="Listing"/>
-      </w:pPr>
-      <w:r>
-        <w:t xml:space="preserve">        } catch (Exception e) {</w:t>
-      </w:r>
-    </w:p>
-    <w:p>
-      <w:pPr>
-        <w:pStyle w:val="Listing"/>
-      </w:pPr>
-      <w:r>
-        <w:t xml:space="preserve">            System.out.println("Ошибка:  " + e);</w:t>
-      </w:r>
-    </w:p>
-    <w:p>
-      <w:pPr>
-        <w:pStyle w:val="Listing"/>
-      </w:pPr>
-      <w:r>
-        <w:t xml:space="preserve">        }</w:t>
-      </w:r>
-    </w:p>
-    <w:p>
-      <w:pPr>
-        <w:pStyle w:val="Listing"/>
-      </w:pPr>
-      <w:r>
-        <w:t xml:space="preserve">    }</w:t>
-      </w:r>
-    </w:p>
-    <w:p>
-      <w:pPr>
-        <w:pStyle w:val="Listing"/>
-      </w:pPr>
-    </w:p>
-    <w:p>
-      <w:pPr>
-        <w:pStyle w:val="Listing"/>
-      </w:pPr>
-      <w:r>
-        <w:t xml:space="preserve">    public void run() {</w:t>
-      </w:r>
-    </w:p>
-    <w:p>
-      <w:pPr>
-        <w:pStyle w:val="Listing"/>
-      </w:pPr>
-      <w:r>
-        <w:t xml:space="preserve">        if (s == null) { // соединение не установлено</w:t>
-      </w:r>
-    </w:p>
-    <w:p>
-      <w:pPr>
-        <w:pStyle w:val="Listing"/>
-      </w:pPr>
-      <w:r>
-        <w:t xml:space="preserve">            window.log.append(name + ": нет связи с сервером " + host + "\n");</w:t>
-      </w:r>
-    </w:p>
-    <w:p>
-      <w:pPr>
-        <w:pStyle w:val="Listing"/>
-      </w:pPr>
-      <w:r>
-        <w:t xml:space="preserve">            return;</w:t>
-      </w:r>
-    </w:p>
-    <w:p>
-      <w:pPr>
-        <w:pStyle w:val="Listing"/>
-      </w:pPr>
-      <w:r>
-        <w:t xml:space="preserve">        }</w:t>
-      </w:r>
-    </w:p>
-    <w:p>
-      <w:pPr>
-        <w:pStyle w:val="Listing"/>
-      </w:pPr>
-      <w:r>
-        <w:t xml:space="preserve">        try {</w:t>
-      </w:r>
-    </w:p>
-    <w:p>
-      <w:pPr>
-        <w:pStyle w:val="Listing"/>
-      </w:pPr>
-      <w:r>
-        <w:t xml:space="preserve">            // Отправка запроса серверу</w:t>
-      </w:r>
-    </w:p>
-    <w:p>
-      <w:pPr>
-        <w:pStyle w:val="Listing"/>
-      </w:pPr>
-      <w:r>
-        <w:t xml:space="preserve">            PrintStream ps = new PrintStream(s.getOutputStream());</w:t>
-      </w:r>
-    </w:p>
-    <w:p>
-      <w:pPr>
-        <w:pStyle w:val="Listing"/>
-      </w:pPr>
-      <w:r>
-        <w:t xml:space="preserve">            ps.println(request);</w:t>
-      </w:r>
-    </w:p>
-    <w:p>
-      <w:pPr>
-        <w:pStyle w:val="Listing"/>
-      </w:pPr>
-      <w:r>
-        <w:t xml:space="preserve">            ps.flush();</w:t>
-      </w:r>
-    </w:p>
-    <w:p>
-      <w:pPr>
-        <w:pStyle w:val="Listing"/>
-      </w:pPr>
-    </w:p>
-    <w:p>
-      <w:pPr>
-        <w:pStyle w:val="Listing"/>
-      </w:pPr>
-      <w:r>
-        <w:t xml:space="preserve">            String msg = dis.readLine(); // Клиент читает строку из сокета</w:t>
-      </w:r>
-    </w:p>
-    <w:p>
-      <w:pPr>
-        <w:pStyle w:val="Listing"/>
-      </w:pPr>
-      <w:r>
-        <w:t xml:space="preserve">            if (msg != null) {</w:t>
-      </w:r>
-    </w:p>
-    <w:p>
-      <w:pPr>
-        <w:pStyle w:val="Listing"/>
-      </w:pPr>
-      <w:r>
-        <w:t xml:space="preserve">                System.out.println(name + ": " + msg);</w:t>
-      </w:r>
-    </w:p>
-    <w:p>
-      <w:pPr>
-        <w:pStyle w:val="Listing"/>
-      </w:pPr>
-      <w:r>
-        <w:t xml:space="preserve">                window.showMessage(name + ": " + msg);</w:t>
-      </w:r>
-    </w:p>
-    <w:p>
-      <w:pPr>
-        <w:pStyle w:val="Listing"/>
-      </w:pPr>
-      <w:r>
-        <w:t xml:space="preserve">            }</w:t>
-      </w:r>
-    </w:p>
-    <w:p>
-      <w:pPr>
-        <w:pStyle w:val="Listing"/>
-      </w:pPr>
-      <w:r>
-        <w:t xml:space="preserve">            s.close();</w:t>
-      </w:r>
-    </w:p>
-    <w:p>
-      <w:pPr>
-        <w:pStyle w:val="Listing"/>
-      </w:pPr>
-      <w:r>
-        <w:t xml:space="preserve">        } catch (Exception e) {</w:t>
-      </w:r>
-    </w:p>
-    <w:p>
-      <w:pPr>
-        <w:pStyle w:val="Listing"/>
-      </w:pPr>
-      <w:r>
-        <w:t xml:space="preserve">            System.out.println("ERRORR+" + e);</w:t>
-      </w:r>
-    </w:p>
-    <w:p>
-      <w:pPr>
-        <w:pStyle w:val="Listing"/>
-      </w:pPr>
-      <w:r>
-        <w:t xml:space="preserve">        }</w:t>
-      </w:r>
-    </w:p>
-    <w:p>
-      <w:pPr>
-        <w:pStyle w:val="Listing"/>
-      </w:pPr>
-      <w:r>
-        <w:t xml:space="preserve">    }</w:t>
-      </w:r>
-    </w:p>
-    <w:p>
-      <w:pPr>
-        <w:pStyle w:val="Listing"/>
-      </w:pPr>
-      <w:r>
-        <w:t>}</w:t>
-      </w:r>
-    </w:p>
-    <w:p/>
+        <w:t xml:space="preserve"> (пересылка данных от клиента к серверу), изменяет счет и отправляет ответ клиенту. Код клиентского потока приведен в приложении А.</w:t>
+      </w:r>
+    </w:p>
     <w:p>
       <w:pPr>
         <w:ind w:firstLine="709"/>
@@ -2557,721 +1761,23 @@
         <w:t>serv</w:t>
       </w:r>
       <w:r>
-        <w:t>, код которого приведен в листинге.</w:t>
-      </w:r>
-    </w:p>
-    <w:p>
-      <w:pPr>
-        <w:keepNext/>
-        <w:ind w:firstLine="709"/>
-        <w:jc w:val="both"/>
-      </w:pPr>
-      <w:r>
-        <w:t xml:space="preserve">Листинг 3.3 – Окно приложения </w:t>
-      </w:r>
-      <w:r>
-        <w:rPr>
-          <w:i/>
-        </w:rPr>
-        <w:t>serv</w:t>
-      </w:r>
-    </w:p>
-    <w:p>
-      <w:pPr>
-        <w:pStyle w:val="Listing"/>
-      </w:pPr>
-      <w:r>
-        <w:t>// Окно приложения</w:t>
-      </w:r>
-    </w:p>
-    <w:p>
-      <w:pPr>
-        <w:pStyle w:val="Listing"/>
-      </w:pPr>
-      <w:r>
-        <w:t>public class serv extends Frame implements ActionListener {</w:t>
-      </w:r>
-    </w:p>
-    <w:p>
-      <w:pPr>
-        <w:pStyle w:val="Listing"/>
-      </w:pPr>
-      <w:r>
-        <w:t xml:space="preserve">    Button client1Add = new Button("Клиент 1: добавить");</w:t>
-      </w:r>
-    </w:p>
-    <w:p>
-      <w:pPr>
-        <w:pStyle w:val="Listing"/>
-      </w:pPr>
-      <w:r>
-        <w:t xml:space="preserve">    Button client1Withdraw = new Button("Клиент 1: снять");</w:t>
-      </w:r>
-    </w:p>
-    <w:p>
-      <w:pPr>
-        <w:pStyle w:val="Listing"/>
-      </w:pPr>
-      <w:r>
-        <w:t xml:space="preserve">    Button client2Withdraw = new Button("Клиент 2: снять");</w:t>
-      </w:r>
-    </w:p>
-    <w:p>
-      <w:pPr>
-        <w:pStyle w:val="Listing"/>
-      </w:pPr>
-      <w:r>
-        <w:t xml:space="preserve">    TextField accountField = new TextField("200", 10);</w:t>
-      </w:r>
-    </w:p>
-    <w:p>
-      <w:pPr>
-        <w:pStyle w:val="Listing"/>
-      </w:pPr>
-      <w:r>
-        <w:t xml:space="preserve">    TextArea log = new TextArea(8, 40);</w:t>
-      </w:r>
-    </w:p>
-    <w:p>
-      <w:pPr>
-        <w:pStyle w:val="Listing"/>
-      </w:pPr>
-      <w:r>
-        <w:t xml:space="preserve">    String host; // адрес компьютера, на котором работает сервер</w:t>
-      </w:r>
-    </w:p>
-    <w:p>
-      <w:pPr>
-        <w:pStyle w:val="Listing"/>
-      </w:pPr>
-    </w:p>
-    <w:p>
-      <w:pPr>
-        <w:pStyle w:val="Listing"/>
-      </w:pPr>
-      <w:r>
-        <w:t xml:space="preserve">    public serv() {</w:t>
-      </w:r>
-    </w:p>
-    <w:p>
-      <w:pPr>
-        <w:pStyle w:val="Listing"/>
-      </w:pPr>
-      <w:r>
-        <w:t xml:space="preserve">        this("127.0.0.1");</w:t>
-      </w:r>
-    </w:p>
-    <w:p>
-      <w:pPr>
-        <w:pStyle w:val="Listing"/>
-      </w:pPr>
-      <w:r>
-        <w:t xml:space="preserve">    }</w:t>
-      </w:r>
-    </w:p>
-    <w:p>
-      <w:pPr>
-        <w:pStyle w:val="Listing"/>
-      </w:pPr>
-    </w:p>
-    <w:p>
-      <w:pPr>
-        <w:pStyle w:val="Listing"/>
-      </w:pPr>
-      <w:r>
-        <w:t xml:space="preserve">    public serv(String host) {</w:t>
-      </w:r>
-    </w:p>
-    <w:p>
-      <w:pPr>
-        <w:pStyle w:val="Listing"/>
-      </w:pPr>
-      <w:r>
-        <w:t xml:space="preserve">        super("Счёт");</w:t>
-      </w:r>
-    </w:p>
-    <w:p>
-      <w:pPr>
-        <w:pStyle w:val="Listing"/>
-      </w:pPr>
-      <w:r>
-        <w:t xml:space="preserve">        this.host = host;</w:t>
-      </w:r>
-    </w:p>
-    <w:p>
-      <w:pPr>
-        <w:pStyle w:val="Listing"/>
-      </w:pPr>
-      <w:r>
-        <w:t xml:space="preserve">        setLayout(new FlowLayout());</w:t>
-      </w:r>
-    </w:p>
-    <w:p>
-      <w:pPr>
-        <w:pStyle w:val="Listing"/>
-      </w:pPr>
-      <w:r>
-        <w:t xml:space="preserve">        add(client1Add);</w:t>
-      </w:r>
-    </w:p>
-    <w:p>
-      <w:pPr>
-        <w:pStyle w:val="Listing"/>
-      </w:pPr>
-      <w:r>
-        <w:t xml:space="preserve">        add(client1Withdraw);</w:t>
-      </w:r>
-    </w:p>
-    <w:p>
-      <w:pPr>
-        <w:pStyle w:val="Listing"/>
-      </w:pPr>
-      <w:r>
-        <w:t xml:space="preserve">        add(client2Withdraw);</w:t>
-      </w:r>
-    </w:p>
-    <w:p>
-      <w:pPr>
-        <w:pStyle w:val="Listing"/>
-      </w:pPr>
-      <w:r>
-        <w:t xml:space="preserve">        add(new Label("Счёт:"));</w:t>
-      </w:r>
-    </w:p>
-    <w:p>
-      <w:pPr>
-        <w:pStyle w:val="Listing"/>
-      </w:pPr>
-      <w:r>
-        <w:t xml:space="preserve">        add(accountField);</w:t>
-      </w:r>
-    </w:p>
-    <w:p>
-      <w:pPr>
-        <w:pStyle w:val="Listing"/>
-      </w:pPr>
-      <w:r>
-        <w:t xml:space="preserve">        add(log);</w:t>
-      </w:r>
-    </w:p>
-    <w:p>
-      <w:pPr>
-        <w:pStyle w:val="Listing"/>
-      </w:pPr>
-    </w:p>
-    <w:p>
-      <w:pPr>
-        <w:pStyle w:val="Listing"/>
-      </w:pPr>
-      <w:r>
-        <w:t xml:space="preserve">        client1Add.addActionListener(this);</w:t>
-      </w:r>
-    </w:p>
-    <w:p>
-      <w:pPr>
-        <w:pStyle w:val="Listing"/>
-      </w:pPr>
-      <w:r>
-        <w:t xml:space="preserve">        client1Withdraw.addActionListener(this);</w:t>
-      </w:r>
-    </w:p>
-    <w:p>
-      <w:pPr>
-        <w:pStyle w:val="Listing"/>
-      </w:pPr>
-      <w:r>
-        <w:t xml:space="preserve">        client2Withdraw.addActionListener(this);</w:t>
-      </w:r>
-    </w:p>
-    <w:p>
-      <w:pPr>
-        <w:pStyle w:val="Listing"/>
-      </w:pPr>
-    </w:p>
-    <w:p>
-      <w:pPr>
-        <w:pStyle w:val="Listing"/>
-      </w:pPr>
-      <w:r>
-        <w:t xml:space="preserve">        addWindowListener(new WindowAdapter() {</w:t>
-      </w:r>
-    </w:p>
-    <w:p>
-      <w:pPr>
-        <w:pStyle w:val="Listing"/>
-      </w:pPr>
-      <w:r>
-        <w:t xml:space="preserve">            public void windowClosing(WindowEvent we) {</w:t>
-      </w:r>
-    </w:p>
-    <w:p>
-      <w:pPr>
-        <w:pStyle w:val="Listing"/>
-      </w:pPr>
-      <w:r>
-        <w:t xml:space="preserve">                System.exit(0); // Закрыть приложение</w:t>
-      </w:r>
-    </w:p>
-    <w:p>
-      <w:pPr>
-        <w:pStyle w:val="Listing"/>
-      </w:pPr>
-      <w:r>
-        <w:t xml:space="preserve">            }</w:t>
-      </w:r>
-    </w:p>
-    <w:p>
-      <w:pPr>
-        <w:pStyle w:val="Listing"/>
-      </w:pPr>
-      <w:r>
-        <w:t xml:space="preserve">        });</w:t>
-      </w:r>
-    </w:p>
-    <w:p>
-      <w:pPr>
-        <w:pStyle w:val="Listing"/>
-      </w:pPr>
-      <w:r>
-        <w:t xml:space="preserve">    }</w:t>
-      </w:r>
-    </w:p>
-    <w:p>
-      <w:pPr>
-        <w:pStyle w:val="Listing"/>
-      </w:pPr>
-    </w:p>
-    <w:p>
-      <w:pPr>
-        <w:pStyle w:val="Listing"/>
-      </w:pPr>
-      <w:r>
-        <w:t xml:space="preserve">    // Запуск клиента по нажатию кнопки</w:t>
-      </w:r>
-    </w:p>
-    <w:p>
-      <w:pPr>
-        <w:pStyle w:val="Listing"/>
-      </w:pPr>
-      <w:r>
-        <w:t xml:space="preserve">    public void actionPerformed(ActionEvent ae) {</w:t>
-      </w:r>
-    </w:p>
-    <w:p>
-      <w:pPr>
-        <w:pStyle w:val="Listing"/>
-      </w:pPr>
-      <w:r>
-        <w:t xml:space="preserve">        if (ae.getSource() == client1Add)</w:t>
-      </w:r>
-    </w:p>
-    <w:p>
-      <w:pPr>
-        <w:pStyle w:val="Listing"/>
-      </w:pPr>
-      <w:r>
-        <w:t xml:space="preserve">            new clientThread("Клиент 1", "ADD", this, host).start();</w:t>
-      </w:r>
-    </w:p>
-    <w:p>
-      <w:pPr>
-        <w:pStyle w:val="Listing"/>
-      </w:pPr>
-      <w:r>
-        <w:t xml:space="preserve">        else if (ae.getSource() == client1Withdraw)</w:t>
-      </w:r>
-    </w:p>
-    <w:p>
-      <w:pPr>
-        <w:pStyle w:val="Listing"/>
-      </w:pPr>
-      <w:r>
-        <w:t xml:space="preserve">            new clientThread("Клиент 1", "WITHDRAW", this, host).start();</w:t>
-      </w:r>
-    </w:p>
-    <w:p>
-      <w:pPr>
-        <w:pStyle w:val="Listing"/>
-      </w:pPr>
-      <w:r>
-        <w:t xml:space="preserve">        else if (ae.getSource() == client2Withdraw)</w:t>
-      </w:r>
-    </w:p>
-    <w:p>
-      <w:pPr>
-        <w:pStyle w:val="Listing"/>
-      </w:pPr>
-      <w:r>
-        <w:t xml:space="preserve">            new clientThread("Клиент 2", "WITHDRAW", this, host).start();</w:t>
-      </w:r>
-    </w:p>
-    <w:p>
-      <w:pPr>
-        <w:pStyle w:val="Listing"/>
-      </w:pPr>
-      <w:r>
-        <w:t xml:space="preserve">    }</w:t>
-      </w:r>
-    </w:p>
-    <w:p>
-      <w:pPr>
-        <w:pStyle w:val="Listing"/>
-      </w:pPr>
-    </w:p>
-    <w:p>
-      <w:pPr>
-        <w:pStyle w:val="Listing"/>
-      </w:pPr>
-      <w:r>
-        <w:t xml:space="preserve">    // Отображение состояния счёта</w:t>
-      </w:r>
-    </w:p>
-    <w:p>
-      <w:pPr>
-        <w:pStyle w:val="Listing"/>
-      </w:pPr>
-      <w:r>
-        <w:t xml:space="preserve">    public void showMessage(String message) {</w:t>
-      </w:r>
-    </w:p>
-    <w:p>
-      <w:pPr>
-        <w:pStyle w:val="Listing"/>
-      </w:pPr>
-      <w:r>
-        <w:t xml:space="preserve">        accountField.setText(message.substring(message.indexOf(':', message.indexOf(':') + 1) + 1));</w:t>
-      </w:r>
-    </w:p>
-    <w:p>
-      <w:pPr>
-        <w:pStyle w:val="Listing"/>
-      </w:pPr>
-      <w:r>
-        <w:t xml:space="preserve">        log.append(message + "\n");</w:t>
-      </w:r>
-    </w:p>
-    <w:p>
-      <w:pPr>
-        <w:pStyle w:val="Listing"/>
-      </w:pPr>
-      <w:r>
-        <w:t xml:space="preserve">    }</w:t>
-      </w:r>
-    </w:p>
-    <w:p>
-      <w:pPr>
-        <w:pStyle w:val="Listing"/>
-      </w:pPr>
-    </w:p>
-    <w:p>
-      <w:pPr>
-        <w:pStyle w:val="Listing"/>
-      </w:pPr>
-      <w:r>
-        <w:t xml:space="preserve">    // IP-адреса этого компьютера в локальной сети (для ввода на других компьютерах)</w:t>
-      </w:r>
-    </w:p>
-    <w:p>
-      <w:pPr>
-        <w:pStyle w:val="Listing"/>
-      </w:pPr>
-      <w:r>
-        <w:t xml:space="preserve">    static String localAddresses() {</w:t>
-      </w:r>
-    </w:p>
-    <w:p>
-      <w:pPr>
-        <w:pStyle w:val="Listing"/>
-      </w:pPr>
-      <w:r>
-        <w:t xml:space="preserve">        String result = "";</w:t>
-      </w:r>
-    </w:p>
-    <w:p>
-      <w:pPr>
-        <w:pStyle w:val="Listing"/>
-      </w:pPr>
-      <w:r>
-        <w:t xml:space="preserve">        try {</w:t>
-      </w:r>
-    </w:p>
-    <w:p>
-      <w:pPr>
-        <w:pStyle w:val="Listing"/>
-      </w:pPr>
-      <w:r>
-        <w:t xml:space="preserve">            Enumeration&lt;NetworkInterface&gt; interfaces = NetworkInterface.getNetworkInterfaces();</w:t>
-      </w:r>
-    </w:p>
-    <w:p>
-      <w:pPr>
-        <w:pStyle w:val="Listing"/>
-      </w:pPr>
-      <w:r>
-        <w:t xml:space="preserve">            while (interfaces.hasMoreElements()) {</w:t>
-      </w:r>
-    </w:p>
-    <w:p>
-      <w:pPr>
-        <w:pStyle w:val="Listing"/>
-      </w:pPr>
-      <w:r>
-        <w:t xml:space="preserve">                NetworkInterface ni = interfaces.nextElement();</w:t>
-      </w:r>
-    </w:p>
-    <w:p>
-      <w:pPr>
-        <w:pStyle w:val="Listing"/>
-      </w:pPr>
-      <w:r>
-        <w:t xml:space="preserve">                if (!ni.isUp() || ni.isLoopback())</w:t>
-      </w:r>
-    </w:p>
-    <w:p>
-      <w:pPr>
-        <w:pStyle w:val="Listing"/>
-      </w:pPr>
-      <w:r>
-        <w:lastRenderedPageBreak/>
-        <w:t xml:space="preserve">                    continue;</w:t>
-      </w:r>
-    </w:p>
-    <w:p>
-      <w:pPr>
-        <w:pStyle w:val="Listing"/>
-      </w:pPr>
-      <w:r>
-        <w:t xml:space="preserve">                Enumeration&lt;InetAddress&gt; addresses = ni.getInetAddresses();</w:t>
-      </w:r>
-    </w:p>
-    <w:p>
-      <w:pPr>
-        <w:pStyle w:val="Listing"/>
-      </w:pPr>
-      <w:r>
-        <w:t xml:space="preserve">                while (addresses.hasMoreElements()) {</w:t>
-      </w:r>
-    </w:p>
-    <w:p>
-      <w:pPr>
-        <w:pStyle w:val="Listing"/>
-      </w:pPr>
-      <w:r>
-        <w:t xml:space="preserve">                    InetAddress address = addresses.nextElement();</w:t>
-      </w:r>
-    </w:p>
-    <w:p>
-      <w:pPr>
-        <w:pStyle w:val="Listing"/>
-      </w:pPr>
-      <w:r>
-        <w:t xml:space="preserve">                    if (address instanceof Inet4Address)</w:t>
-      </w:r>
-    </w:p>
-    <w:p>
-      <w:pPr>
-        <w:pStyle w:val="Listing"/>
-      </w:pPr>
-      <w:r>
-        <w:t xml:space="preserve">                        result += address.getHostAddress() + " ";</w:t>
-      </w:r>
-    </w:p>
-    <w:p>
-      <w:pPr>
-        <w:pStyle w:val="Listing"/>
-      </w:pPr>
-      <w:r>
-        <w:t xml:space="preserve">                }</w:t>
-      </w:r>
-    </w:p>
-    <w:p>
-      <w:pPr>
-        <w:pStyle w:val="Listing"/>
-      </w:pPr>
-      <w:r>
-        <w:t xml:space="preserve">            }</w:t>
-      </w:r>
-    </w:p>
-    <w:p>
-      <w:pPr>
-        <w:pStyle w:val="Listing"/>
-      </w:pPr>
-      <w:r>
-        <w:t xml:space="preserve">        } catch (Exception e) {</w:t>
-      </w:r>
-    </w:p>
-    <w:p>
-      <w:pPr>
-        <w:pStyle w:val="Listing"/>
-      </w:pPr>
-      <w:r>
-        <w:t xml:space="preserve">            System.out.println("Ошибка " + e);</w:t>
-      </w:r>
-    </w:p>
-    <w:p>
-      <w:pPr>
-        <w:pStyle w:val="Listing"/>
-      </w:pPr>
-      <w:r>
-        <w:t xml:space="preserve">        }</w:t>
-      </w:r>
-    </w:p>
-    <w:p>
-      <w:pPr>
-        <w:pStyle w:val="Listing"/>
-      </w:pPr>
-      <w:r>
-        <w:t xml:space="preserve">        return result.trim();</w:t>
-      </w:r>
-    </w:p>
-    <w:p>
-      <w:pPr>
-        <w:pStyle w:val="Listing"/>
-      </w:pPr>
-      <w:r>
-        <w:t xml:space="preserve">    }</w:t>
-      </w:r>
-    </w:p>
-    <w:p>
-      <w:pPr>
-        <w:pStyle w:val="Listing"/>
-      </w:pPr>
-    </w:p>
-    <w:p>
-      <w:pPr>
-        <w:pStyle w:val="Listing"/>
-      </w:pPr>
-      <w:r>
-        <w:t xml:space="preserve">    public static void main(String args[]) {</w:t>
-      </w:r>
-    </w:p>
-    <w:p>
-      <w:pPr>
-        <w:pStyle w:val="Listing"/>
-      </w:pPr>
-      <w:r>
-        <w:t xml:space="preserve">        if (args.length == 0) { // сервер и клиенты на одном компьютере</w:t>
-      </w:r>
-    </w:p>
-    <w:p>
-      <w:pPr>
-        <w:pStyle w:val="Listing"/>
-      </w:pPr>
-      <w:r>
-        <w:t xml:space="preserve">            serv f = new serv();</w:t>
-      </w:r>
-    </w:p>
-    <w:p>
-      <w:pPr>
-        <w:pStyle w:val="Listing"/>
-      </w:pPr>
-      <w:r>
-        <w:t xml:space="preserve">            f.setTitle("Счёт (сервер, IP: " + localAddresses() + ")");</w:t>
-      </w:r>
-    </w:p>
-    <w:p>
-      <w:pPr>
-        <w:pStyle w:val="Listing"/>
-      </w:pPr>
-      <w:r>
-        <w:t xml:space="preserve">            f.setSize(400, 400);</w:t>
-      </w:r>
-    </w:p>
-    <w:p>
-      <w:pPr>
-        <w:pStyle w:val="Listing"/>
-      </w:pPr>
-      <w:r>
-        <w:t xml:space="preserve">            f.setVisible(true);</w:t>
-      </w:r>
-    </w:p>
-    <w:p>
-      <w:pPr>
-        <w:pStyle w:val="Listing"/>
-      </w:pPr>
-      <w:r>
-        <w:t xml:space="preserve">            new Account(f).start();</w:t>
-      </w:r>
-    </w:p>
-    <w:p>
-      <w:pPr>
-        <w:pStyle w:val="Listing"/>
-      </w:pPr>
-      <w:r>
-        <w:t xml:space="preserve">        } else { // только клиенты, сервер на другом компьютере</w:t>
-      </w:r>
-    </w:p>
-    <w:p>
-      <w:pPr>
-        <w:pStyle w:val="Listing"/>
-      </w:pPr>
-      <w:r>
-        <w:t xml:space="preserve">            serv f = new serv(args[0]);</w:t>
-      </w:r>
-    </w:p>
-    <w:p>
-      <w:pPr>
-        <w:pStyle w:val="Listing"/>
-      </w:pPr>
-      <w:r>
-        <w:t xml:space="preserve">            f.setTitle("Счёт (клиент, сервер: " + args[0] + ")");</w:t>
-      </w:r>
-    </w:p>
-    <w:p>
-      <w:pPr>
-        <w:pStyle w:val="Listing"/>
-      </w:pPr>
-      <w:r>
-        <w:t xml:space="preserve">            f.setSize(400, 400);</w:t>
-      </w:r>
-    </w:p>
-    <w:p>
-      <w:pPr>
-        <w:pStyle w:val="Listing"/>
-      </w:pPr>
-      <w:r>
-        <w:t xml:space="preserve">            f.setVisible(true);</w:t>
-      </w:r>
-    </w:p>
-    <w:p>
-      <w:pPr>
-        <w:pStyle w:val="Listing"/>
-      </w:pPr>
-      <w:r>
-        <w:t xml:space="preserve">        }</w:t>
-      </w:r>
-    </w:p>
-    <w:p>
-      <w:pPr>
-        <w:pStyle w:val="Listing"/>
-      </w:pPr>
-      <w:r>
-        <w:t xml:space="preserve">    }</w:t>
-      </w:r>
-    </w:p>
-    <w:p>
-      <w:pPr>
-        <w:pStyle w:val="Listing"/>
-      </w:pPr>
-      <w:r>
-        <w:t>}</w:t>
-      </w:r>
-    </w:p>
-    <w:p/>
+        <w:t>, код которого приведен в приложении А.</w:t>
+      </w:r>
+    </w:p>
     <w:p>
       <w:pPr>
         <w:pStyle w:val="21"/>
         <w:spacing w:before="360"/>
         <w:ind w:firstLine="709"/>
       </w:pPr>
-      <w:bookmarkStart w:id="5" w:name="_Toc242426571"/>
+      <w:bookmarkStart w:id="6" w:name="_Toc242612914"/>
       <w:r>
         <w:rPr>
           <w:rFonts w:ascii="Times New Roman" w:hAnsi="Times New Roman"/>
         </w:rPr>
-        <w:t>3.3 Результаты работы</w:t>
-      </w:r>
-      <w:bookmarkEnd w:id="5"/>
+        <w:t>2.5 Результаты работы</w:t>
+      </w:r>
+      <w:bookmarkEnd w:id="6"/>
     </w:p>
     <w:p>
       <w:pPr>
@@ -3279,7 +1785,7 @@
         <w:jc w:val="both"/>
       </w:pPr>
       <w:r>
-        <w:t>Окно после запуска показано на рисунке 3.1.</w:t>
+        <w:t>Окно после запуска показано на рисунке 2.1.</w:t>
       </w:r>
     </w:p>
     <w:p>
@@ -3294,7 +1800,7 @@
         </w:rPr>
         <w:lastRenderedPageBreak/>
         <w:drawing>
-          <wp:inline distT="0" distB="0" distL="0" distR="0" wp14:anchorId="7B47F745" wp14:editId="12E604DC">
+          <wp:inline distT="0" distB="0" distL="0" distR="0" wp14:anchorId="2F96B63F" wp14:editId="43DA6607">
             <wp:extent cx="5580000" cy="3560156"/>
             <wp:effectExtent l="0" t="0" r="0" b="0"/>
             <wp:docPr id="1" name="Picture 1"/>
@@ -3336,7 +1842,7 @@
         <w:jc w:val="center"/>
       </w:pPr>
       <w:r>
-        <w:t>Рисунок 3.1 – Окно приложения после запуска</w:t>
+        <w:t>Рисунок 2.1 – Окно приложения после запуска</w:t>
       </w:r>
     </w:p>
     <w:p/>
@@ -3364,7 +1870,7 @@
         <w:jc w:val="both"/>
       </w:pPr>
       <w:r>
-        <w:t>Нажатие кнопки «Клиент 1: добавить» запускает поток первого клиента, результат показан на рисунке 3.2.</w:t>
+        <w:t>Нажатие кнопки «Клиент 1: добавить» запускает поток первого клиента, результат показан на рисунке 2.2.</w:t>
       </w:r>
     </w:p>
     <w:p>
@@ -3378,7 +1884,7 @@
           <w:noProof/>
         </w:rPr>
         <w:drawing>
-          <wp:inline distT="0" distB="0" distL="0" distR="0" wp14:anchorId="1D5529E4" wp14:editId="6734CB9E">
+          <wp:inline distT="0" distB="0" distL="0" distR="0" wp14:anchorId="2C88FDE6" wp14:editId="1E8134DA">
             <wp:extent cx="5580000" cy="3560156"/>
             <wp:effectExtent l="0" t="0" r="0" b="0"/>
             <wp:docPr id="2" name="Picture 2"/>
@@ -3420,7 +1926,7 @@
         <w:jc w:val="center"/>
       </w:pPr>
       <w:r>
-        <w:t>Рисунок 3.2 – Клиент 1 добавил деньги на счет</w:t>
+        <w:t>Рисунок 2.2 – Клиент 1 добавил деньги на счет</w:t>
       </w:r>
     </w:p>
     <w:p/>
@@ -3439,7 +1945,7 @@
         <w:jc w:val="both"/>
       </w:pPr>
       <w:r>
-        <w:t>Операция снятия клиентом 1 показана на рисунке 3.3.</w:t>
+        <w:t>Операция снятия клиентом 1 показана на рисунке 2.3.</w:t>
       </w:r>
     </w:p>
     <w:p>
@@ -3453,7 +1959,7 @@
           <w:noProof/>
         </w:rPr>
         <w:drawing>
-          <wp:inline distT="0" distB="0" distL="0" distR="0" wp14:anchorId="6F746AA6" wp14:editId="602C64FA">
+          <wp:inline distT="0" distB="0" distL="0" distR="0" wp14:anchorId="5DD54FEF" wp14:editId="5B685B44">
             <wp:extent cx="5580000" cy="3560156"/>
             <wp:effectExtent l="0" t="0" r="0" b="0"/>
             <wp:docPr id="3" name="Picture 3"/>
@@ -3495,7 +2001,7 @@
         <w:jc w:val="center"/>
       </w:pPr>
       <w:r>
-        <w:t>Рисунок 3.3 – Клиент 1 снял деньги со счета</w:t>
+        <w:t>Рисунок 2.3 – Клиент 1 снял деньги со счета</w:t>
       </w:r>
     </w:p>
     <w:p/>
@@ -3514,7 +2020,7 @@
         <w:jc w:val="both"/>
       </w:pPr>
       <w:r>
-        <w:t>Клиент 2 выполняет только снятие, результат показан на рисунке 3.4.</w:t>
+        <w:t>Клиент 2 выполняет только снятие, результат показан на рисунке 2.4.</w:t>
       </w:r>
     </w:p>
     <w:p>
@@ -3529,7 +2035,7 @@
         </w:rPr>
         <w:lastRenderedPageBreak/>
         <w:drawing>
-          <wp:inline distT="0" distB="0" distL="0" distR="0" wp14:anchorId="222AC2A2" wp14:editId="5D798556">
+          <wp:inline distT="0" distB="0" distL="0" distR="0" wp14:anchorId="4D821891" wp14:editId="12F55CDA">
             <wp:extent cx="5580000" cy="3560156"/>
             <wp:effectExtent l="0" t="0" r="0" b="0"/>
             <wp:docPr id="4" name="Picture 4"/>
@@ -3571,7 +2077,7 @@
         <w:jc w:val="center"/>
       </w:pPr>
       <w:r>
-        <w:t>Рисунок 3.4 – Клиент 2 снял деньги со счета</w:t>
+        <w:t>Рисунок 2.4 – Клиент 2 снял деньги со счета</w:t>
       </w:r>
     </w:p>
     <w:p/>
@@ -3590,7 +2096,7 @@
         <w:jc w:val="both"/>
       </w:pPr>
       <w:r>
-        <w:t>Итоговое состояние после нескольких операций показано на рисунке 3.5.</w:t>
+        <w:t>Итоговое состояние после нескольких операций показано на рисунке 2.5.</w:t>
       </w:r>
     </w:p>
     <w:p>
@@ -3605,7 +2111,7 @@
         </w:rPr>
         <w:lastRenderedPageBreak/>
         <w:drawing>
-          <wp:inline distT="0" distB="0" distL="0" distR="0" wp14:anchorId="19FD0ED5" wp14:editId="1C2ECC03">
+          <wp:inline distT="0" distB="0" distL="0" distR="0" wp14:anchorId="69F7D96E" wp14:editId="645D40AD">
             <wp:extent cx="5580000" cy="3560156"/>
             <wp:effectExtent l="0" t="0" r="0" b="0"/>
             <wp:docPr id="5" name="Picture 5"/>
@@ -3647,7 +2153,7 @@
         <w:jc w:val="center"/>
       </w:pPr>
       <w:r>
-        <w:t>Рисунок 3.5 – Состояние счета после нескольких операций</w:t>
+        <w:t>Рисунок 2.5 – Состояние счета после нескольких операций</w:t>
       </w:r>
     </w:p>
     <w:p/>
@@ -3666,14 +2172,14 @@
         <w:spacing w:before="360"/>
         <w:ind w:firstLine="709"/>
       </w:pPr>
-      <w:bookmarkStart w:id="6" w:name="_Toc242426572"/>
+      <w:bookmarkStart w:id="7" w:name="_Toc242612915"/>
       <w:r>
         <w:rPr>
           <w:rFonts w:ascii="Times New Roman" w:hAnsi="Times New Roman"/>
         </w:rPr>
-        <w:t>3.4 Запуск на нескольких компьютерах</w:t>
-      </w:r>
-      <w:bookmarkEnd w:id="6"/>
+        <w:t>2.6 Запуск на нескольких компьютерах</w:t>
+      </w:r>
+      <w:bookmarkEnd w:id="7"/>
     </w:p>
     <w:p>
       <w:pPr>
@@ -3732,10 +2238,20 @@
     <w:p>
       <w:pPr>
         <w:keepNext/>
+        <w:ind w:firstLine="709"/>
+        <w:jc w:val="both"/>
+      </w:pPr>
+      <w:r>
+        <w:t>Данные по теме «запуск приложения на разных компьютерах» приведены в таблице 2.1.</w:t>
+      </w:r>
+    </w:p>
+    <w:p>
+      <w:pPr>
+        <w:keepNext/>
         <w:spacing w:before="360"/>
       </w:pPr>
       <w:r>
-        <w:t>Таблица 3.1 – Запуск приложения на разных компьютерах</w:t>
+        <w:t>Таблица 2.1 – Запуск приложения на разных компьютерах</w:t>
       </w:r>
     </w:p>
     <w:tbl>
@@ -4090,23 +2606,14 @@
         <w:jc w:val="both"/>
       </w:pPr>
       <w:r>
+        <w:lastRenderedPageBreak/>
         <w:t xml:space="preserve">Клиент подключается к порту 3001 сервера, поэтому на компьютере с сервером этот порт должен быть открыт в брандмауэре (скрипт </w:t>
       </w:r>
       <w:r>
         <w:rPr>
           <w:i/>
         </w:rPr>
-        <w:t>ADMIN-open</w:t>
-      </w:r>
-      <w:r>
-        <w:t>-</w:t>
-      </w:r>
-      <w:r>
-        <w:rPr>
-          <w:i/>
-        </w:rPr>
-        <w:lastRenderedPageBreak/>
-        <w:t>port-3001.bat</w:t>
+        <w:t>ADMIN-open-port-3001.bat</w:t>
       </w:r>
       <w:r>
         <w:t xml:space="preserve">), а компьютеры должны находиться в одной сети. Проверка выполнена с клиентом в </w:t>
@@ -4154,7 +2661,7 @@
         <w:t>WSL</w:t>
       </w:r>
       <w:r>
-        <w:t xml:space="preserve"> (172.19.64.1). Окно клиента показано на рисунке 3.6.</w:t>
+        <w:t xml:space="preserve"> (172.19.64.1). Окно клиента показано на рисунке 2.6.</w:t>
       </w:r>
     </w:p>
     <w:p>
@@ -4168,7 +2675,7 @@
           <w:noProof/>
         </w:rPr>
         <w:drawing>
-          <wp:inline distT="0" distB="0" distL="0" distR="0" wp14:anchorId="4A553F45" wp14:editId="43690C0A">
+          <wp:inline distT="0" distB="0" distL="0" distR="0" wp14:anchorId="68872661" wp14:editId="23D848E8">
             <wp:extent cx="5580000" cy="3817164"/>
             <wp:effectExtent l="0" t="0" r="0" b="0"/>
             <wp:docPr id="6" name="Picture 6"/>
@@ -4210,7 +2717,7 @@
         <w:jc w:val="center"/>
       </w:pPr>
       <w:r>
-        <w:t xml:space="preserve">Рисунок 3.6 – Клиент в </w:t>
+        <w:t xml:space="preserve">Рисунок 2.6 – Клиент в </w:t>
       </w:r>
       <w:r>
         <w:rPr>
@@ -4247,7 +2754,7 @@
         <w:jc w:val="both"/>
       </w:pPr>
       <w:r>
-        <w:t>После нажатия кнопок клиента счет изменяется на сервере, результат на стороне клиента показан на рисунке 3.7.</w:t>
+        <w:t>После нажатия кнопок клиента счет изменяется на сервере, результат на стороне клиента показан на рисунке 2.7.</w:t>
       </w:r>
     </w:p>
     <w:p>
@@ -4262,7 +2769,7 @@
         </w:rPr>
         <w:lastRenderedPageBreak/>
         <w:drawing>
-          <wp:inline distT="0" distB="0" distL="0" distR="0" wp14:anchorId="2FFFAA89" wp14:editId="7E3E0782">
+          <wp:inline distT="0" distB="0" distL="0" distR="0" wp14:anchorId="3B71B4D0" wp14:editId="143262D0">
             <wp:extent cx="5580000" cy="4566964"/>
             <wp:effectExtent l="0" t="0" r="0" b="0"/>
             <wp:docPr id="7" name="Picture 7"/>
@@ -4304,7 +2811,7 @@
         <w:jc w:val="center"/>
       </w:pPr>
       <w:r>
-        <w:t xml:space="preserve">Рисунок 3.7 – Клиент в </w:t>
+        <w:t xml:space="preserve">Рисунок 2.7 – Клиент в </w:t>
       </w:r>
       <w:r>
         <w:rPr>
@@ -4341,7 +2848,7 @@
         <w:jc w:val="both"/>
       </w:pPr>
       <w:r>
-        <w:t>Окно сервера после этих операций показано на рисунке 3.8.</w:t>
+        <w:t>Окно сервера после этих операций показано на рисунке 2.8.</w:t>
       </w:r>
     </w:p>
     <w:p>
@@ -4356,7 +2863,7 @@
         </w:rPr>
         <w:lastRenderedPageBreak/>
         <w:drawing>
-          <wp:inline distT="0" distB="0" distL="0" distR="0" wp14:anchorId="2CB2F9D8" wp14:editId="6927916F">
+          <wp:inline distT="0" distB="0" distL="0" distR="0" wp14:anchorId="6C057178" wp14:editId="27DEF35E">
             <wp:extent cx="5580000" cy="3560156"/>
             <wp:effectExtent l="0" t="0" r="0" b="0"/>
             <wp:docPr id="8" name="Picture 8"/>
@@ -4398,7 +2905,7 @@
         <w:jc w:val="center"/>
       </w:pPr>
       <w:r>
-        <w:t xml:space="preserve">Рисунок 3.8 – Журнал сервера в </w:t>
+        <w:t xml:space="preserve">Рисунок 2.8 – Журнал сервера в </w:t>
       </w:r>
       <w:r>
         <w:rPr>
@@ -4427,54 +2934,13 @@
         <w:pStyle w:val="1"/>
         <w:ind w:firstLine="709"/>
       </w:pPr>
-      <w:bookmarkStart w:id="7" w:name="_Toc242426573"/>
+      <w:bookmarkStart w:id="8" w:name="_Toc242612916"/>
       <w:r>
         <w:rPr>
           <w:rFonts w:ascii="Times New Roman" w:hAnsi="Times New Roman"/>
         </w:rPr>
         <w:lastRenderedPageBreak/>
-        <w:t>4 КОНТРОЛЬНЫЕ ВОПРОСЫ</w:t>
-      </w:r>
-      <w:bookmarkEnd w:id="7"/>
-    </w:p>
-    <w:p>
-      <w:pPr>
-        <w:pStyle w:val="21"/>
-        <w:spacing w:before="360"/>
-        <w:ind w:firstLine="709"/>
-      </w:pPr>
-      <w:bookmarkStart w:id="8" w:name="_Toc242426574"/>
-      <w:r>
-        <w:rPr>
-          <w:rFonts w:ascii="Times New Roman" w:hAnsi="Times New Roman"/>
-        </w:rPr>
-        <w:t xml:space="preserve">4.1 Назначение протоколов </w:t>
-      </w:r>
-      <w:r>
-        <w:rPr>
-          <w:rFonts w:ascii="Times New Roman" w:hAnsi="Times New Roman"/>
-          <w:i/>
-        </w:rPr>
-        <w:t>TCP</w:t>
-      </w:r>
-      <w:r>
-        <w:rPr>
-          <w:rFonts w:ascii="Times New Roman" w:hAnsi="Times New Roman"/>
-        </w:rPr>
-        <w:t xml:space="preserve"> и </w:t>
-      </w:r>
-      <w:r>
-        <w:rPr>
-          <w:rFonts w:ascii="Times New Roman" w:hAnsi="Times New Roman"/>
-          <w:i/>
-        </w:rPr>
-        <w:t>UDP</w:t>
-      </w:r>
-      <w:r>
-        <w:rPr>
-          <w:rFonts w:ascii="Times New Roman" w:hAnsi="Times New Roman"/>
-        </w:rPr>
-        <w:t xml:space="preserve"> и их отличие</w:t>
+        <w:t>3 Ответы на контрольные вопросы</w:t>
       </w:r>
       <w:bookmarkEnd w:id="8"/>
     </w:p>
@@ -4483,6 +2949,9 @@
         <w:ind w:firstLine="709"/>
         <w:jc w:val="both"/>
       </w:pPr>
+      <w:r>
+        <w:t xml:space="preserve">1. Каково назначение протоколов </w:t>
+      </w:r>
       <w:r>
         <w:rPr>
           <w:i/>
@@ -4490,7 +2959,7 @@
         <w:t>TCP</w:t>
       </w:r>
       <w:r>
-        <w:t xml:space="preserve"> – протокол с установлением соединения: он гарантирует доставку данных, сохраняет порядок пакетов и повторно передает потерянные. </w:t>
+        <w:t xml:space="preserve"> и </w:t>
       </w:r>
       <w:r>
         <w:rPr>
@@ -4499,8 +2968,14 @@
         <w:t>UDP</w:t>
       </w:r>
       <w:r>
-        <w:t xml:space="preserve"> работает без постоянного соединения, не гарантирует доставку и порядок, но имеет меньшие накладные расходы. В работе используется </w:t>
-      </w:r>
+        <w:t xml:space="preserve"> и в чем их отличие?</w:t>
+      </w:r>
+    </w:p>
+    <w:p>
+      <w:pPr>
+        <w:ind w:firstLine="709"/>
+        <w:jc w:val="both"/>
+      </w:pPr>
       <w:r>
         <w:rPr>
           <w:i/>
@@ -4508,6 +2983,24 @@
         <w:t>TCP</w:t>
       </w:r>
       <w:r>
+        <w:t xml:space="preserve"> – протокол с установлением соединения: он гарантирует доставку данных, сохраняет порядок пакетов и повторно передает потерянные. </w:t>
+      </w:r>
+      <w:r>
+        <w:rPr>
+          <w:i/>
+        </w:rPr>
+        <w:t>UDP</w:t>
+      </w:r>
+      <w:r>
+        <w:t xml:space="preserve"> работает без постоянного соединения, не гарантирует доставку и порядок, но имеет меньшие накладные расходы. В работе используется </w:t>
+      </w:r>
+      <w:r>
+        <w:rPr>
+          <w:i/>
+        </w:rPr>
+        <w:t>TCP</w:t>
+      </w:r>
+      <w:r>
         <w:t xml:space="preserve">, так как применяются классы </w:t>
       </w:r>
       <w:r>
@@ -4531,18 +3024,12 @@
     </w:p>
     <w:p>
       <w:pPr>
-        <w:pStyle w:val="21"/>
-        <w:spacing w:before="360"/>
         <w:ind w:firstLine="709"/>
-      </w:pPr>
-      <w:bookmarkStart w:id="9" w:name="_Toc242426575"/>
-      <w:r>
-        <w:rPr>
-          <w:rFonts w:ascii="Times New Roman" w:hAnsi="Times New Roman"/>
-        </w:rPr>
-        <w:t>4.2 Объекты и методы отправки данных по сети</w:t>
-      </w:r>
-      <w:bookmarkEnd w:id="9"/>
+        <w:jc w:val="both"/>
+      </w:pPr>
+      <w:r>
+        <w:t>2. Какие объекты и методы используются для отправки данных по сети?</w:t>
+      </w:r>
     </w:p>
     <w:p>
       <w:pPr>
@@ -4559,7 +3046,10 @@
         <w:t>s.getOutputStream</w:t>
       </w:r>
       <w:r>
-        <w:t xml:space="preserve">() оборачивается в </w:t>
+        <w:t>()</w:t>
+      </w:r>
+      <w:r>
+        <w:t xml:space="preserve"> оборачивается в </w:t>
       </w:r>
       <w:r>
         <w:rPr>
@@ -4577,7 +3067,10 @@
         <w:t>println</w:t>
       </w:r>
       <w:r>
-        <w:t xml:space="preserve">() записывается строка, методом </w:t>
+        <w:t>()</w:t>
+      </w:r>
+      <w:r>
+        <w:t xml:space="preserve"> записывается строка, методом </w:t>
       </w:r>
       <w:r>
         <w:rPr>
@@ -4586,7 +3079,10 @@
         <w:t>flush</w:t>
       </w:r>
       <w:r>
-        <w:t xml:space="preserve">() буфер принудительно отправляется. Читаются данные из </w:t>
+        <w:t>()</w:t>
+      </w:r>
+      <w:r>
+        <w:t xml:space="preserve"> буфер принудительно отправляется. Читаются данные из </w:t>
       </w:r>
       <w:r>
         <w:rPr>
@@ -4595,7 +3091,10 @@
         <w:t>s.getInputStream</w:t>
       </w:r>
       <w:r>
-        <w:t xml:space="preserve">() через </w:t>
+        <w:t>()</w:t>
+      </w:r>
+      <w:r>
+        <w:t xml:space="preserve"> через </w:t>
       </w:r>
       <w:r>
         <w:rPr>
@@ -4622,23 +3121,20 @@
         <w:t>readLine</w:t>
       </w:r>
       <w:r>
-        <w:t>().</w:t>
-      </w:r>
-    </w:p>
-    <w:p>
-      <w:pPr>
-        <w:pStyle w:val="21"/>
-        <w:spacing w:before="360"/>
+        <w:t>()</w:t>
+      </w:r>
+      <w:r>
+        <w:t>.</w:t>
+      </w:r>
+    </w:p>
+    <w:p>
+      <w:pPr>
         <w:ind w:firstLine="709"/>
-      </w:pPr>
-      <w:bookmarkStart w:id="10" w:name="_Toc242426576"/>
-      <w:r>
-        <w:rPr>
-          <w:rFonts w:ascii="Times New Roman" w:hAnsi="Times New Roman"/>
-        </w:rPr>
-        <w:t>4.3 Пересылка данных в обратном направлении (от клиента к серверу)</w:t>
-      </w:r>
-      <w:bookmarkEnd w:id="10"/>
+        <w:jc w:val="both"/>
+      </w:pPr>
+      <w:r>
+        <w:t>3. Как переслать данные в обратном направлении (от клиента к серверу)?</w:t>
+      </w:r>
     </w:p>
     <w:p>
       <w:pPr>
@@ -4664,7 +3160,10 @@
         <w:t>s.getOutputStream</w:t>
       </w:r>
       <w:r>
-        <w:t xml:space="preserve">() и отправляет строку запроса, сервер читает ее через </w:t>
+        <w:t>()</w:t>
+      </w:r>
+      <w:r>
+        <w:t xml:space="preserve"> и отправляет строку запроса, сервер читает ее через </w:t>
       </w:r>
       <w:r>
         <w:rPr>
@@ -4682,7 +3181,10 @@
         <w:t>s.getInputStream</w:t>
       </w:r>
       <w:r>
-        <w:t xml:space="preserve">() методом </w:t>
+        <w:t>()</w:t>
+      </w:r>
+      <w:r>
+        <w:t xml:space="preserve"> методом </w:t>
       </w:r>
       <w:r>
         <w:rPr>
@@ -4691,7 +3193,10 @@
         <w:t>readLine</w:t>
       </w:r>
       <w:r>
-        <w:t xml:space="preserve">(). В работе так передаются запросы </w:t>
+        <w:t>()</w:t>
+      </w:r>
+      <w:r>
+        <w:t xml:space="preserve">. В работе так передаются запросы </w:t>
       </w:r>
       <w:r>
         <w:rPr>
@@ -4714,18 +3219,12 @@
     </w:p>
     <w:p>
       <w:pPr>
-        <w:pStyle w:val="21"/>
-        <w:spacing w:before="360"/>
         <w:ind w:firstLine="709"/>
-      </w:pPr>
-      <w:bookmarkStart w:id="11" w:name="_Toc242426577"/>
-      <w:r>
-        <w:rPr>
-          <w:rFonts w:ascii="Times New Roman" w:hAnsi="Times New Roman"/>
-        </w:rPr>
-        <w:t>4.4 Как определить сетевой адрес своего компьютера</w:t>
-      </w:r>
-      <w:bookmarkEnd w:id="11"/>
+        <w:jc w:val="both"/>
+      </w:pPr>
+      <w:r>
+        <w:t>4. Как определить сетевой адрес своего компьютера?</w:t>
+      </w:r>
     </w:p>
     <w:p>
       <w:pPr>
@@ -4800,15 +3299,15 @@
         <w:pStyle w:val="1"/>
         <w:jc w:val="center"/>
       </w:pPr>
-      <w:bookmarkStart w:id="12" w:name="_Toc242426578"/>
+      <w:bookmarkStart w:id="9" w:name="_Toc242612917"/>
       <w:r>
         <w:rPr>
           <w:rFonts w:ascii="Times New Roman" w:hAnsi="Times New Roman"/>
         </w:rPr>
         <w:lastRenderedPageBreak/>
-        <w:t>ЗАКЛЮЧЕНИЕ</w:t>
-      </w:r>
-      <w:bookmarkEnd w:id="12"/>
+        <w:t>Выводы</w:t>
+      </w:r>
+      <w:bookmarkEnd w:id="9"/>
     </w:p>
     <w:p>
       <w:pPr>
@@ -4843,9 +3342,1493 @@
         <w:t>Socket</w:t>
       </w:r>
       <w:r>
-        <w:t>, реализована передача запросов от клиентов к серверу и ответов в обратном направлении. По варианту 2 два клиента работают с общим счетом: клиент 1 добавляет и снимает деньги, клиент 2 только снимает. Приложение с графическим интерфейсом запускает клиента по нажатию кнопки и отражает состояние счета в текстовом поле. Цель работы достигнута.</w:t>
-      </w:r>
-    </w:p>
+        <w:t>, реализована передача запросов от клиентов к серверу и ответов в обратном направлении. По варианту 2 два клиента работают с общим счетом: клиент 1 добавляет и снимает деньги, клиент 2 только снимает. Приложение с графическим интерфейсом запускает клиента по нажатию кнопки и отражает состояние счета в текстовом поле. Поставленная цель достигнута.</w:t>
+      </w:r>
+    </w:p>
+    <w:p>
+      <w:r>
+        <w:br w:type="page"/>
+      </w:r>
+    </w:p>
+    <w:p>
+      <w:pPr>
+        <w:pStyle w:val="1"/>
+        <w:jc w:val="center"/>
+      </w:pPr>
+      <w:bookmarkStart w:id="10" w:name="_Toc242612918"/>
+      <w:r>
+        <w:lastRenderedPageBreak/>
+        <w:t>Приложение А</w:t>
+      </w:r>
+      <w:r>
+        <w:br/>
+      </w:r>
+      <w:r>
+        <w:rPr>
+          <w:caps w:val="0"/>
+        </w:rPr>
+        <w:t>(обязательное)</w:t>
+      </w:r>
+      <w:r>
+        <w:rPr>
+          <w:caps w:val="0"/>
+        </w:rPr>
+        <w:br/>
+        <w:t>Листинги программного кода</w:t>
+      </w:r>
+      <w:bookmarkEnd w:id="10"/>
+    </w:p>
+    <w:p>
+      <w:pPr>
+        <w:keepNext/>
+        <w:ind w:firstLine="709"/>
+        <w:jc w:val="both"/>
+      </w:pPr>
+      <w:r>
+        <w:t xml:space="preserve">Листинг А.1 – Серверный поток </w:t>
+      </w:r>
+      <w:r>
+        <w:rPr>
+          <w:i/>
+        </w:rPr>
+        <w:t>Account</w:t>
+      </w:r>
+    </w:p>
+    <w:p>
+      <w:pPr>
+        <w:pStyle w:val="Listing"/>
+      </w:pPr>
+      <w:r>
+        <w:t>// Серверный поток: хранит счёт и обрабатывает запросы клиентов</w:t>
+      </w:r>
+    </w:p>
+    <w:p>
+      <w:pPr>
+        <w:pStyle w:val="Listing"/>
+      </w:pPr>
+      <w:r>
+        <w:t>class Account extends Thread {</w:t>
+      </w:r>
+    </w:p>
+    <w:p>
+      <w:pPr>
+        <w:pStyle w:val="Listing"/>
+      </w:pPr>
+      <w:r>
+        <w:t xml:space="preserve">    ServerSocket server;</w:t>
+      </w:r>
+    </w:p>
+    <w:p>
+      <w:pPr>
+        <w:pStyle w:val="Listing"/>
+      </w:pPr>
+      <w:r>
+        <w:t xml:space="preserve">    String amountstring;</w:t>
+      </w:r>
+    </w:p>
+    <w:p>
+      <w:pPr>
+        <w:pStyle w:val="Listing"/>
+      </w:pPr>
+      <w:r>
+        <w:t xml:space="preserve">    static int amount = 200;</w:t>
+      </w:r>
+    </w:p>
+    <w:p>
+      <w:pPr>
+        <w:pStyle w:val="Listing"/>
+      </w:pPr>
+      <w:r>
+        <w:t xml:space="preserve">    serv window; // окно, в журнал которого сервер записывает запросы</w:t>
+      </w:r>
+    </w:p>
+    <w:p>
+      <w:pPr>
+        <w:pStyle w:val="Listing"/>
+      </w:pPr>
+    </w:p>
+    <w:p>
+      <w:pPr>
+        <w:pStyle w:val="Listing"/>
+      </w:pPr>
+      <w:r>
+        <w:t xml:space="preserve">    public Account(serv window) {</w:t>
+      </w:r>
+    </w:p>
+    <w:p>
+      <w:pPr>
+        <w:pStyle w:val="Listing"/>
+      </w:pPr>
+      <w:r>
+        <w:t xml:space="preserve">        this.window = window;</w:t>
+      </w:r>
+    </w:p>
+    <w:p>
+      <w:pPr>
+        <w:pStyle w:val="Listing"/>
+      </w:pPr>
+      <w:r>
+        <w:t xml:space="preserve">    }</w:t>
+      </w:r>
+    </w:p>
+    <w:p>
+      <w:pPr>
+        <w:pStyle w:val="Listing"/>
+      </w:pPr>
+    </w:p>
+    <w:p>
+      <w:pPr>
+        <w:pStyle w:val="Listing"/>
+      </w:pPr>
+      <w:r>
+        <w:t xml:space="preserve">    public void run() {</w:t>
+      </w:r>
+    </w:p>
+    <w:p>
+      <w:pPr>
+        <w:pStyle w:val="Listing"/>
+      </w:pPr>
+      <w:r>
+        <w:t xml:space="preserve">        try {</w:t>
+      </w:r>
+    </w:p>
+    <w:p>
+      <w:pPr>
+        <w:pStyle w:val="Listing"/>
+      </w:pPr>
+      <w:r>
+        <w:t xml:space="preserve">            server = new ServerSocket(3001); // Номер сокета</w:t>
+      </w:r>
+    </w:p>
+    <w:p>
+      <w:pPr>
+        <w:pStyle w:val="Listing"/>
+      </w:pPr>
+      <w:r>
+        <w:t xml:space="preserve">        } catch (Exception e) {</w:t>
+      </w:r>
+    </w:p>
+    <w:p>
+      <w:pPr>
+        <w:pStyle w:val="Listing"/>
+      </w:pPr>
+      <w:r>
+        <w:t xml:space="preserve">            System.out.println("Ошибка соединения+" + e);</w:t>
+      </w:r>
+    </w:p>
+    <w:p>
+      <w:pPr>
+        <w:pStyle w:val="Listing"/>
+      </w:pPr>
+      <w:r>
+        <w:t xml:space="preserve">        }</w:t>
+      </w:r>
+    </w:p>
+    <w:p>
+      <w:pPr>
+        <w:pStyle w:val="Listing"/>
+      </w:pPr>
+      <w:r>
+        <w:t xml:space="preserve">        while (true) {</w:t>
+      </w:r>
+    </w:p>
+    <w:p>
+      <w:pPr>
+        <w:pStyle w:val="Listing"/>
+      </w:pPr>
+      <w:r>
+        <w:t xml:space="preserve">            Socket s = null;</w:t>
+      </w:r>
+    </w:p>
+    <w:p>
+      <w:pPr>
+        <w:pStyle w:val="Listing"/>
+      </w:pPr>
+      <w:r>
+        <w:t xml:space="preserve">            try {</w:t>
+      </w:r>
+    </w:p>
+    <w:p>
+      <w:pPr>
+        <w:pStyle w:val="Listing"/>
+      </w:pPr>
+      <w:r>
+        <w:t xml:space="preserve">                s = server.accept(); // ожидание соединения с клиентом</w:t>
+      </w:r>
+    </w:p>
+    <w:p>
+      <w:pPr>
+        <w:pStyle w:val="Listing"/>
+      </w:pPr>
+      <w:r>
+        <w:t xml:space="preserve">            } catch (Exception e) {</w:t>
+      </w:r>
+    </w:p>
+    <w:p>
+      <w:pPr>
+        <w:pStyle w:val="Listing"/>
+      </w:pPr>
+      <w:r>
+        <w:t xml:space="preserve">                System.out.println("Ошибка" + e);</w:t>
+      </w:r>
+    </w:p>
+    <w:p>
+      <w:pPr>
+        <w:pStyle w:val="Listing"/>
+      </w:pPr>
+      <w:r>
+        <w:t xml:space="preserve">            }</w:t>
+      </w:r>
+    </w:p>
+    <w:p>
+      <w:pPr>
+        <w:pStyle w:val="Listing"/>
+      </w:pPr>
+      <w:r>
+        <w:t xml:space="preserve">            try {</w:t>
+      </w:r>
+    </w:p>
+    <w:p>
+      <w:pPr>
+        <w:pStyle w:val="Listing"/>
+      </w:pPr>
+      <w:r>
+        <w:t xml:space="preserve">                // Чтение запроса клиента (ADD или WITHDRAW)</w:t>
+      </w:r>
+    </w:p>
+    <w:p>
+      <w:pPr>
+        <w:pStyle w:val="Listing"/>
+      </w:pPr>
+      <w:r>
+        <w:t xml:space="preserve">                BufferedReader in = new BufferedReader(new InputStreamReader(s.getInputStream()));</w:t>
+      </w:r>
+    </w:p>
+    <w:p>
+      <w:pPr>
+        <w:pStyle w:val="Listing"/>
+      </w:pPr>
+      <w:r>
+        <w:t xml:space="preserve">                String request = in.readLine();</w:t>
+      </w:r>
+    </w:p>
+    <w:p>
+      <w:pPr>
+        <w:pStyle w:val="Listing"/>
+      </w:pPr>
+    </w:p>
+    <w:p>
+      <w:pPr>
+        <w:pStyle w:val="Listing"/>
+      </w:pPr>
+      <w:r>
+        <w:t xml:space="preserve">                PrintStream ps = new PrintStream(s.getOutputStream()); // PrintStream предназначен для текстового вывода</w:t>
+      </w:r>
+    </w:p>
+    <w:p>
+      <w:pPr>
+        <w:pStyle w:val="Listing"/>
+      </w:pPr>
+      <w:r>
+        <w:t xml:space="preserve">                int amountcur = ((int) (Math.random() * 1000));</w:t>
+      </w:r>
+    </w:p>
+    <w:p>
+      <w:pPr>
+        <w:pStyle w:val="Listing"/>
+      </w:pPr>
+      <w:r>
+        <w:t xml:space="preserve">                if (request.equals("ADD"))</w:t>
+      </w:r>
+    </w:p>
+    <w:p>
+      <w:pPr>
+        <w:pStyle w:val="Listing"/>
+      </w:pPr>
+      <w:r>
+        <w:t xml:space="preserve">                    amount += amountcur;</w:t>
+      </w:r>
+    </w:p>
+    <w:p>
+      <w:pPr>
+        <w:pStyle w:val="Listing"/>
+      </w:pPr>
+      <w:r>
+        <w:t xml:space="preserve">                else</w:t>
+      </w:r>
+    </w:p>
+    <w:p>
+      <w:pPr>
+        <w:pStyle w:val="Listing"/>
+      </w:pPr>
+      <w:r>
+        <w:t xml:space="preserve">                    amount -= amountcur;</w:t>
+      </w:r>
+    </w:p>
+    <w:p>
+      <w:pPr>
+        <w:pStyle w:val="Listing"/>
+      </w:pPr>
+      <w:r>
+        <w:t xml:space="preserve">                amountstring = Integer.toString(amount);</w:t>
+      </w:r>
+    </w:p>
+    <w:p>
+      <w:pPr>
+        <w:pStyle w:val="Listing"/>
+      </w:pPr>
+      <w:r>
+        <w:t xml:space="preserve">                ps.println("Account:" + amountstring); // передача строки клиенту</w:t>
+      </w:r>
+    </w:p>
+    <w:p>
+      <w:pPr>
+        <w:pStyle w:val="Listing"/>
+      </w:pPr>
+      <w:r>
+        <w:t xml:space="preserve">                ps.flush();</w:t>
+      </w:r>
+    </w:p>
+    <w:p>
+      <w:pPr>
+        <w:pStyle w:val="Listing"/>
+      </w:pPr>
+      <w:r>
+        <w:t xml:space="preserve">                // Запись в журнал сервера: откуда пришёл запрос и каким стал счёт</w:t>
+      </w:r>
+    </w:p>
+    <w:p>
+      <w:pPr>
+        <w:pStyle w:val="Listing"/>
+      </w:pPr>
+      <w:r>
+        <w:t xml:space="preserve">                window.log.append("[сервер] " + request + " от " + s.getInetAddress().getHostAddress() + ", счёт: " + amountstring + "\n");</w:t>
+      </w:r>
+    </w:p>
+    <w:p>
+      <w:pPr>
+        <w:pStyle w:val="Listing"/>
+      </w:pPr>
+      <w:r>
+        <w:t xml:space="preserve">                window.accountField.setText(amountstring);</w:t>
+      </w:r>
+    </w:p>
+    <w:p>
+      <w:pPr>
+        <w:pStyle w:val="Listing"/>
+      </w:pPr>
+      <w:r>
+        <w:t xml:space="preserve">                s.close(); // Сокетное соединение закрывается</w:t>
+      </w:r>
+    </w:p>
+    <w:p>
+      <w:pPr>
+        <w:pStyle w:val="Listing"/>
+      </w:pPr>
+      <w:r>
+        <w:t xml:space="preserve">            } catch (Exception e) {</w:t>
+      </w:r>
+    </w:p>
+    <w:p>
+      <w:pPr>
+        <w:pStyle w:val="Listing"/>
+      </w:pPr>
+      <w:r>
+        <w:lastRenderedPageBreak/>
+        <w:t xml:space="preserve">                System.out.println("Ошибка  " + e);</w:t>
+      </w:r>
+    </w:p>
+    <w:p>
+      <w:pPr>
+        <w:pStyle w:val="Listing"/>
+      </w:pPr>
+      <w:r>
+        <w:t xml:space="preserve">            }</w:t>
+      </w:r>
+    </w:p>
+    <w:p>
+      <w:pPr>
+        <w:pStyle w:val="Listing"/>
+      </w:pPr>
+      <w:r>
+        <w:t xml:space="preserve">        }</w:t>
+      </w:r>
+    </w:p>
+    <w:p>
+      <w:pPr>
+        <w:pStyle w:val="Listing"/>
+      </w:pPr>
+      <w:r>
+        <w:t xml:space="preserve">    }</w:t>
+      </w:r>
+    </w:p>
+    <w:p>
+      <w:pPr>
+        <w:pStyle w:val="Listing"/>
+      </w:pPr>
+      <w:r>
+        <w:t>}</w:t>
+      </w:r>
+    </w:p>
+    <w:p/>
+    <w:p>
+      <w:pPr>
+        <w:keepNext/>
+        <w:ind w:firstLine="709"/>
+        <w:jc w:val="both"/>
+      </w:pPr>
+      <w:r>
+        <w:t xml:space="preserve">Листинг А.2 – Клиентский поток </w:t>
+      </w:r>
+      <w:r>
+        <w:rPr>
+          <w:i/>
+        </w:rPr>
+        <w:t>clientThread</w:t>
+      </w:r>
+    </w:p>
+    <w:p>
+      <w:pPr>
+        <w:pStyle w:val="Listing"/>
+      </w:pPr>
+      <w:r>
+        <w:t>// Клиентский поток: отправляет запрос серверу и читает ответ</w:t>
+      </w:r>
+    </w:p>
+    <w:p>
+      <w:pPr>
+        <w:pStyle w:val="Listing"/>
+      </w:pPr>
+      <w:r>
+        <w:t>class clientThread extends Thread {</w:t>
+      </w:r>
+    </w:p>
+    <w:p>
+      <w:pPr>
+        <w:pStyle w:val="Listing"/>
+      </w:pPr>
+      <w:r>
+        <w:t xml:space="preserve">    DataInputStream dis = null;</w:t>
+      </w:r>
+    </w:p>
+    <w:p>
+      <w:pPr>
+        <w:pStyle w:val="Listing"/>
+      </w:pPr>
+      <w:r>
+        <w:t xml:space="preserve">    Socket s = null;</w:t>
+      </w:r>
+    </w:p>
+    <w:p>
+      <w:pPr>
+        <w:pStyle w:val="Listing"/>
+      </w:pPr>
+      <w:r>
+        <w:t xml:space="preserve">    String name;</w:t>
+      </w:r>
+    </w:p>
+    <w:p>
+      <w:pPr>
+        <w:pStyle w:val="Listing"/>
+      </w:pPr>
+      <w:r>
+        <w:t xml:space="preserve">    String request;</w:t>
+      </w:r>
+    </w:p>
+    <w:p>
+      <w:pPr>
+        <w:pStyle w:val="Listing"/>
+      </w:pPr>
+      <w:r>
+        <w:t xml:space="preserve">    String host;</w:t>
+      </w:r>
+    </w:p>
+    <w:p>
+      <w:pPr>
+        <w:pStyle w:val="Listing"/>
+      </w:pPr>
+      <w:r>
+        <w:t xml:space="preserve">    serv window;</w:t>
+      </w:r>
+    </w:p>
+    <w:p>
+      <w:pPr>
+        <w:pStyle w:val="Listing"/>
+      </w:pPr>
+    </w:p>
+    <w:p>
+      <w:pPr>
+        <w:pStyle w:val="Listing"/>
+      </w:pPr>
+      <w:r>
+        <w:t xml:space="preserve">    public clientThread(String name, String request, serv window, String host) {</w:t>
+      </w:r>
+    </w:p>
+    <w:p>
+      <w:pPr>
+        <w:pStyle w:val="Listing"/>
+      </w:pPr>
+      <w:r>
+        <w:t xml:space="preserve">        this.name = name;</w:t>
+      </w:r>
+    </w:p>
+    <w:p>
+      <w:pPr>
+        <w:pStyle w:val="Listing"/>
+      </w:pPr>
+      <w:r>
+        <w:t xml:space="preserve">        this.request = request;</w:t>
+      </w:r>
+    </w:p>
+    <w:p>
+      <w:pPr>
+        <w:pStyle w:val="Listing"/>
+      </w:pPr>
+      <w:r>
+        <w:t xml:space="preserve">        this.window = window;</w:t>
+      </w:r>
+    </w:p>
+    <w:p>
+      <w:pPr>
+        <w:pStyle w:val="Listing"/>
+      </w:pPr>
+      <w:r>
+        <w:t xml:space="preserve">        this.host = host;</w:t>
+      </w:r>
+    </w:p>
+    <w:p>
+      <w:pPr>
+        <w:pStyle w:val="Listing"/>
+      </w:pPr>
+      <w:r>
+        <w:t xml:space="preserve">        try {</w:t>
+      </w:r>
+    </w:p>
+    <w:p>
+      <w:pPr>
+        <w:pStyle w:val="Listing"/>
+      </w:pPr>
+      <w:r>
+        <w:t xml:space="preserve">            s = new Socket(host, 3001);</w:t>
+      </w:r>
+    </w:p>
+    <w:p>
+      <w:pPr>
+        <w:pStyle w:val="Listing"/>
+      </w:pPr>
+      <w:r>
+        <w:t xml:space="preserve">            dis = new DataInputStream(s.getInputStream());</w:t>
+      </w:r>
+    </w:p>
+    <w:p>
+      <w:pPr>
+        <w:pStyle w:val="Listing"/>
+      </w:pPr>
+      <w:r>
+        <w:t xml:space="preserve">        } catch (Exception e) {</w:t>
+      </w:r>
+    </w:p>
+    <w:p>
+      <w:pPr>
+        <w:pStyle w:val="Listing"/>
+      </w:pPr>
+      <w:r>
+        <w:t xml:space="preserve">            System.out.println("Ошибка:  " + e);</w:t>
+      </w:r>
+    </w:p>
+    <w:p>
+      <w:pPr>
+        <w:pStyle w:val="Listing"/>
+      </w:pPr>
+      <w:r>
+        <w:t xml:space="preserve">        }</w:t>
+      </w:r>
+    </w:p>
+    <w:p>
+      <w:pPr>
+        <w:pStyle w:val="Listing"/>
+      </w:pPr>
+      <w:r>
+        <w:t xml:space="preserve">    }</w:t>
+      </w:r>
+    </w:p>
+    <w:p>
+      <w:pPr>
+        <w:pStyle w:val="Listing"/>
+      </w:pPr>
+    </w:p>
+    <w:p>
+      <w:pPr>
+        <w:pStyle w:val="Listing"/>
+      </w:pPr>
+      <w:r>
+        <w:t xml:space="preserve">    public void run() {</w:t>
+      </w:r>
+    </w:p>
+    <w:p>
+      <w:pPr>
+        <w:pStyle w:val="Listing"/>
+      </w:pPr>
+      <w:r>
+        <w:t xml:space="preserve">        if (s == null) { // соединение не установлено</w:t>
+      </w:r>
+    </w:p>
+    <w:p>
+      <w:pPr>
+        <w:pStyle w:val="Listing"/>
+      </w:pPr>
+      <w:r>
+        <w:t xml:space="preserve">            window.log.append(name + ": нет связи с сервером " + host + "\n");</w:t>
+      </w:r>
+    </w:p>
+    <w:p>
+      <w:pPr>
+        <w:pStyle w:val="Listing"/>
+      </w:pPr>
+      <w:r>
+        <w:t xml:space="preserve">            return;</w:t>
+      </w:r>
+    </w:p>
+    <w:p>
+      <w:pPr>
+        <w:pStyle w:val="Listing"/>
+      </w:pPr>
+      <w:r>
+        <w:t xml:space="preserve">        }</w:t>
+      </w:r>
+    </w:p>
+    <w:p>
+      <w:pPr>
+        <w:pStyle w:val="Listing"/>
+      </w:pPr>
+      <w:r>
+        <w:t xml:space="preserve">        try {</w:t>
+      </w:r>
+    </w:p>
+    <w:p>
+      <w:pPr>
+        <w:pStyle w:val="Listing"/>
+      </w:pPr>
+      <w:r>
+        <w:t xml:space="preserve">            // Отправка запроса серверу</w:t>
+      </w:r>
+    </w:p>
+    <w:p>
+      <w:pPr>
+        <w:pStyle w:val="Listing"/>
+      </w:pPr>
+      <w:r>
+        <w:t xml:space="preserve">            PrintStream ps = new PrintStream(s.getOutputStream());</w:t>
+      </w:r>
+    </w:p>
+    <w:p>
+      <w:pPr>
+        <w:pStyle w:val="Listing"/>
+      </w:pPr>
+      <w:r>
+        <w:t xml:space="preserve">            ps.println(request);</w:t>
+      </w:r>
+    </w:p>
+    <w:p>
+      <w:pPr>
+        <w:pStyle w:val="Listing"/>
+      </w:pPr>
+      <w:r>
+        <w:t xml:space="preserve">            ps.flush();</w:t>
+      </w:r>
+    </w:p>
+    <w:p>
+      <w:pPr>
+        <w:pStyle w:val="Listing"/>
+      </w:pPr>
+    </w:p>
+    <w:p>
+      <w:pPr>
+        <w:pStyle w:val="Listing"/>
+      </w:pPr>
+      <w:r>
+        <w:t xml:space="preserve">            String msg = dis.readLine(); // Клиент читает строку из сокета</w:t>
+      </w:r>
+    </w:p>
+    <w:p>
+      <w:pPr>
+        <w:pStyle w:val="Listing"/>
+      </w:pPr>
+      <w:r>
+        <w:t xml:space="preserve">            if (msg != null) {</w:t>
+      </w:r>
+    </w:p>
+    <w:p>
+      <w:pPr>
+        <w:pStyle w:val="Listing"/>
+      </w:pPr>
+      <w:r>
+        <w:t xml:space="preserve">                System.out.println(name + ": " + msg);</w:t>
+      </w:r>
+    </w:p>
+    <w:p>
+      <w:pPr>
+        <w:pStyle w:val="Listing"/>
+      </w:pPr>
+      <w:r>
+        <w:t xml:space="preserve">                window.showMessage(name + ": " + msg);</w:t>
+      </w:r>
+    </w:p>
+    <w:p>
+      <w:pPr>
+        <w:pStyle w:val="Listing"/>
+      </w:pPr>
+      <w:r>
+        <w:t xml:space="preserve">            }</w:t>
+      </w:r>
+    </w:p>
+    <w:p>
+      <w:pPr>
+        <w:pStyle w:val="Listing"/>
+      </w:pPr>
+      <w:r>
+        <w:t xml:space="preserve">            s.close();</w:t>
+      </w:r>
+    </w:p>
+    <w:p>
+      <w:pPr>
+        <w:pStyle w:val="Listing"/>
+      </w:pPr>
+      <w:r>
+        <w:t xml:space="preserve">        } catch (Exception e) {</w:t>
+      </w:r>
+    </w:p>
+    <w:p>
+      <w:pPr>
+        <w:pStyle w:val="Listing"/>
+      </w:pPr>
+      <w:r>
+        <w:t xml:space="preserve">            System.out.println("ERRORR+" + e);</w:t>
+      </w:r>
+    </w:p>
+    <w:p>
+      <w:pPr>
+        <w:pStyle w:val="Listing"/>
+      </w:pPr>
+      <w:r>
+        <w:t xml:space="preserve">        }</w:t>
+      </w:r>
+    </w:p>
+    <w:p>
+      <w:pPr>
+        <w:pStyle w:val="Listing"/>
+      </w:pPr>
+      <w:r>
+        <w:t xml:space="preserve">    }</w:t>
+      </w:r>
+    </w:p>
+    <w:p>
+      <w:pPr>
+        <w:pStyle w:val="Listing"/>
+      </w:pPr>
+      <w:r>
+        <w:t>}</w:t>
+      </w:r>
+    </w:p>
+    <w:p/>
+    <w:p>
+      <w:pPr>
+        <w:keepNext/>
+        <w:ind w:firstLine="709"/>
+        <w:jc w:val="both"/>
+      </w:pPr>
+      <w:r>
+        <w:t xml:space="preserve">Листинг А.3 – Окно приложения </w:t>
+      </w:r>
+      <w:r>
+        <w:rPr>
+          <w:i/>
+        </w:rPr>
+        <w:t>serv</w:t>
+      </w:r>
+    </w:p>
+    <w:p>
+      <w:pPr>
+        <w:pStyle w:val="Listing"/>
+      </w:pPr>
+      <w:r>
+        <w:t>// Окно приложения</w:t>
+      </w:r>
+    </w:p>
+    <w:p>
+      <w:pPr>
+        <w:pStyle w:val="Listing"/>
+      </w:pPr>
+      <w:r>
+        <w:t>public class serv extends Frame implements ActionListener {</w:t>
+      </w:r>
+    </w:p>
+    <w:p>
+      <w:pPr>
+        <w:pStyle w:val="Listing"/>
+      </w:pPr>
+      <w:r>
+        <w:t xml:space="preserve">    Button client1Add = new Button("Клиент 1: добавить");</w:t>
+      </w:r>
+    </w:p>
+    <w:p>
+      <w:pPr>
+        <w:pStyle w:val="Listing"/>
+      </w:pPr>
+      <w:r>
+        <w:t xml:space="preserve">    Button client1Withdraw = new Button("Клиент 1: снять");</w:t>
+      </w:r>
+    </w:p>
+    <w:p>
+      <w:pPr>
+        <w:pStyle w:val="Listing"/>
+      </w:pPr>
+      <w:r>
+        <w:t xml:space="preserve">    Button client2Withdraw = new Button("Клиент 2: снять");</w:t>
+      </w:r>
+    </w:p>
+    <w:p>
+      <w:pPr>
+        <w:pStyle w:val="Listing"/>
+      </w:pPr>
+      <w:r>
+        <w:t xml:space="preserve">    TextField accountField = new TextField("200", 10);</w:t>
+      </w:r>
+    </w:p>
+    <w:p>
+      <w:pPr>
+        <w:pStyle w:val="Listing"/>
+      </w:pPr>
+      <w:r>
+        <w:t xml:space="preserve">    TextArea log = new TextArea(8, 40);</w:t>
+      </w:r>
+    </w:p>
+    <w:p>
+      <w:pPr>
+        <w:pStyle w:val="Listing"/>
+      </w:pPr>
+      <w:r>
+        <w:t xml:space="preserve">    String host; // адрес компьютера, на котором работает сервер</w:t>
+      </w:r>
+    </w:p>
+    <w:p>
+      <w:pPr>
+        <w:pStyle w:val="Listing"/>
+      </w:pPr>
+    </w:p>
+    <w:p>
+      <w:pPr>
+        <w:pStyle w:val="Listing"/>
+      </w:pPr>
+      <w:r>
+        <w:t xml:space="preserve">    public serv() {</w:t>
+      </w:r>
+    </w:p>
+    <w:p>
+      <w:pPr>
+        <w:pStyle w:val="Listing"/>
+      </w:pPr>
+      <w:r>
+        <w:t xml:space="preserve">        this("127.0.0.1");</w:t>
+      </w:r>
+    </w:p>
+    <w:p>
+      <w:pPr>
+        <w:pStyle w:val="Listing"/>
+      </w:pPr>
+      <w:r>
+        <w:t xml:space="preserve">    }</w:t>
+      </w:r>
+    </w:p>
+    <w:p>
+      <w:pPr>
+        <w:pStyle w:val="Listing"/>
+      </w:pPr>
+    </w:p>
+    <w:p>
+      <w:pPr>
+        <w:pStyle w:val="Listing"/>
+      </w:pPr>
+      <w:r>
+        <w:t xml:space="preserve">    public serv(String host) {</w:t>
+      </w:r>
+    </w:p>
+    <w:p>
+      <w:pPr>
+        <w:pStyle w:val="Listing"/>
+      </w:pPr>
+      <w:r>
+        <w:t xml:space="preserve">        super("Счёт");</w:t>
+      </w:r>
+    </w:p>
+    <w:p>
+      <w:pPr>
+        <w:pStyle w:val="Listing"/>
+      </w:pPr>
+      <w:r>
+        <w:t xml:space="preserve">        this.host = host;</w:t>
+      </w:r>
+    </w:p>
+    <w:p>
+      <w:pPr>
+        <w:pStyle w:val="Listing"/>
+      </w:pPr>
+      <w:r>
+        <w:t xml:space="preserve">        setLayout(new FlowLayout());</w:t>
+      </w:r>
+    </w:p>
+    <w:p>
+      <w:pPr>
+        <w:pStyle w:val="Listing"/>
+      </w:pPr>
+      <w:r>
+        <w:t xml:space="preserve">        add(client1Add);</w:t>
+      </w:r>
+    </w:p>
+    <w:p>
+      <w:pPr>
+        <w:pStyle w:val="Listing"/>
+      </w:pPr>
+      <w:r>
+        <w:t xml:space="preserve">        add(client1Withdraw);</w:t>
+      </w:r>
+    </w:p>
+    <w:p>
+      <w:pPr>
+        <w:pStyle w:val="Listing"/>
+      </w:pPr>
+      <w:r>
+        <w:t xml:space="preserve">        add(client2Withdraw);</w:t>
+      </w:r>
+    </w:p>
+    <w:p>
+      <w:pPr>
+        <w:pStyle w:val="Listing"/>
+      </w:pPr>
+      <w:r>
+        <w:t xml:space="preserve">        add(new Label("Счёт:"));</w:t>
+      </w:r>
+    </w:p>
+    <w:p>
+      <w:pPr>
+        <w:pStyle w:val="Listing"/>
+      </w:pPr>
+      <w:r>
+        <w:t xml:space="preserve">        add(accountField);</w:t>
+      </w:r>
+    </w:p>
+    <w:p>
+      <w:pPr>
+        <w:pStyle w:val="Listing"/>
+      </w:pPr>
+      <w:r>
+        <w:t xml:space="preserve">        add(log);</w:t>
+      </w:r>
+    </w:p>
+    <w:p>
+      <w:pPr>
+        <w:pStyle w:val="Listing"/>
+      </w:pPr>
+    </w:p>
+    <w:p>
+      <w:pPr>
+        <w:pStyle w:val="Listing"/>
+      </w:pPr>
+      <w:r>
+        <w:t xml:space="preserve">        client1Add.addActionListener(this);</w:t>
+      </w:r>
+    </w:p>
+    <w:p>
+      <w:pPr>
+        <w:pStyle w:val="Listing"/>
+      </w:pPr>
+      <w:r>
+        <w:t xml:space="preserve">        client1Withdraw.addActionListener(this);</w:t>
+      </w:r>
+    </w:p>
+    <w:p>
+      <w:pPr>
+        <w:pStyle w:val="Listing"/>
+      </w:pPr>
+      <w:r>
+        <w:t xml:space="preserve">        client2Withdraw.addActionListener(this);</w:t>
+      </w:r>
+    </w:p>
+    <w:p>
+      <w:pPr>
+        <w:pStyle w:val="Listing"/>
+      </w:pPr>
+    </w:p>
+    <w:p>
+      <w:pPr>
+        <w:pStyle w:val="Listing"/>
+      </w:pPr>
+      <w:r>
+        <w:t xml:space="preserve">        addWindowListener(new WindowAdapter() {</w:t>
+      </w:r>
+    </w:p>
+    <w:p>
+      <w:pPr>
+        <w:pStyle w:val="Listing"/>
+      </w:pPr>
+      <w:r>
+        <w:t xml:space="preserve">            public void windowClosing(WindowEvent we) {</w:t>
+      </w:r>
+    </w:p>
+    <w:p>
+      <w:pPr>
+        <w:pStyle w:val="Listing"/>
+      </w:pPr>
+      <w:r>
+        <w:t xml:space="preserve">                System.exit(0); // Закрыть приложение</w:t>
+      </w:r>
+    </w:p>
+    <w:p>
+      <w:pPr>
+        <w:pStyle w:val="Listing"/>
+      </w:pPr>
+      <w:r>
+        <w:t xml:space="preserve">            }</w:t>
+      </w:r>
+    </w:p>
+    <w:p>
+      <w:pPr>
+        <w:pStyle w:val="Listing"/>
+      </w:pPr>
+      <w:r>
+        <w:t xml:space="preserve">        });</w:t>
+      </w:r>
+    </w:p>
+    <w:p>
+      <w:pPr>
+        <w:pStyle w:val="Listing"/>
+      </w:pPr>
+      <w:r>
+        <w:t xml:space="preserve">    }</w:t>
+      </w:r>
+    </w:p>
+    <w:p>
+      <w:pPr>
+        <w:pStyle w:val="Listing"/>
+      </w:pPr>
+    </w:p>
+    <w:p>
+      <w:pPr>
+        <w:pStyle w:val="Listing"/>
+      </w:pPr>
+      <w:r>
+        <w:t xml:space="preserve">    // Запуск клиента по нажатию кнопки</w:t>
+      </w:r>
+    </w:p>
+    <w:p>
+      <w:pPr>
+        <w:pStyle w:val="Listing"/>
+      </w:pPr>
+      <w:r>
+        <w:t xml:space="preserve">    public void actionPerformed(ActionEvent ae) {</w:t>
+      </w:r>
+    </w:p>
+    <w:p>
+      <w:pPr>
+        <w:pStyle w:val="Listing"/>
+      </w:pPr>
+      <w:r>
+        <w:t xml:space="preserve">        if (ae.getSource() == client1Add)</w:t>
+      </w:r>
+    </w:p>
+    <w:p>
+      <w:pPr>
+        <w:pStyle w:val="Listing"/>
+      </w:pPr>
+      <w:r>
+        <w:t xml:space="preserve">            new clientThread("Клиент 1", "ADD", this, host).start();</w:t>
+      </w:r>
+    </w:p>
+    <w:p>
+      <w:pPr>
+        <w:pStyle w:val="Listing"/>
+      </w:pPr>
+      <w:r>
+        <w:t xml:space="preserve">        else if (ae.getSource() == client1Withdraw)</w:t>
+      </w:r>
+    </w:p>
+    <w:p>
+      <w:pPr>
+        <w:pStyle w:val="Listing"/>
+      </w:pPr>
+      <w:r>
+        <w:t xml:space="preserve">            new clientThread("Клиент 1", "WITHDRAW", this, host).start();</w:t>
+      </w:r>
+    </w:p>
+    <w:p>
+      <w:pPr>
+        <w:pStyle w:val="Listing"/>
+      </w:pPr>
+      <w:r>
+        <w:t xml:space="preserve">        else if (ae.getSource() == client2Withdraw)</w:t>
+      </w:r>
+    </w:p>
+    <w:p>
+      <w:pPr>
+        <w:pStyle w:val="Listing"/>
+      </w:pPr>
+      <w:r>
+        <w:t xml:space="preserve">            new clientThread("Клиент 2", "WITHDRAW", this, host).start();</w:t>
+      </w:r>
+    </w:p>
+    <w:p>
+      <w:pPr>
+        <w:pStyle w:val="Listing"/>
+      </w:pPr>
+      <w:r>
+        <w:t xml:space="preserve">    }</w:t>
+      </w:r>
+    </w:p>
+    <w:p>
+      <w:pPr>
+        <w:pStyle w:val="Listing"/>
+      </w:pPr>
+    </w:p>
+    <w:p>
+      <w:pPr>
+        <w:pStyle w:val="Listing"/>
+      </w:pPr>
+      <w:r>
+        <w:t xml:space="preserve">    // Отображение состояния счёта</w:t>
+      </w:r>
+    </w:p>
+    <w:p>
+      <w:pPr>
+        <w:pStyle w:val="Listing"/>
+      </w:pPr>
+      <w:r>
+        <w:t xml:space="preserve">    public void showMessage(String message) {</w:t>
+      </w:r>
+    </w:p>
+    <w:p>
+      <w:pPr>
+        <w:pStyle w:val="Listing"/>
+      </w:pPr>
+      <w:r>
+        <w:t xml:space="preserve">        accountField.setText(message.substring(message.indexOf(':', message.indexOf(':') + 1) + 1));</w:t>
+      </w:r>
+    </w:p>
+    <w:p>
+      <w:pPr>
+        <w:pStyle w:val="Listing"/>
+      </w:pPr>
+      <w:r>
+        <w:t xml:space="preserve">        log.append(message + "\n");</w:t>
+      </w:r>
+    </w:p>
+    <w:p>
+      <w:pPr>
+        <w:pStyle w:val="Listing"/>
+      </w:pPr>
+      <w:r>
+        <w:lastRenderedPageBreak/>
+        <w:t xml:space="preserve">    }</w:t>
+      </w:r>
+    </w:p>
+    <w:p>
+      <w:pPr>
+        <w:pStyle w:val="Listing"/>
+      </w:pPr>
+    </w:p>
+    <w:p>
+      <w:pPr>
+        <w:pStyle w:val="Listing"/>
+      </w:pPr>
+      <w:r>
+        <w:t xml:space="preserve">    // IP-адреса этого компьютера в локальной сети (для ввода на других компьютерах)</w:t>
+      </w:r>
+    </w:p>
+    <w:p>
+      <w:pPr>
+        <w:pStyle w:val="Listing"/>
+      </w:pPr>
+      <w:r>
+        <w:t xml:space="preserve">    static String localAddresses() {</w:t>
+      </w:r>
+    </w:p>
+    <w:p>
+      <w:pPr>
+        <w:pStyle w:val="Listing"/>
+      </w:pPr>
+      <w:r>
+        <w:t xml:space="preserve">        String result = "";</w:t>
+      </w:r>
+    </w:p>
+    <w:p>
+      <w:pPr>
+        <w:pStyle w:val="Listing"/>
+      </w:pPr>
+      <w:r>
+        <w:t xml:space="preserve">        try {</w:t>
+      </w:r>
+    </w:p>
+    <w:p>
+      <w:pPr>
+        <w:pStyle w:val="Listing"/>
+      </w:pPr>
+      <w:r>
+        <w:t xml:space="preserve">            Enumeration&lt;NetworkInterface&gt; interfaces = NetworkInterface.getNetworkInterfaces();</w:t>
+      </w:r>
+    </w:p>
+    <w:p>
+      <w:pPr>
+        <w:pStyle w:val="Listing"/>
+      </w:pPr>
+      <w:r>
+        <w:t xml:space="preserve">            while (interfaces.hasMoreElements()) {</w:t>
+      </w:r>
+    </w:p>
+    <w:p>
+      <w:pPr>
+        <w:pStyle w:val="Listing"/>
+      </w:pPr>
+      <w:r>
+        <w:t xml:space="preserve">                NetworkInterface ni = interfaces.nextElement();</w:t>
+      </w:r>
+    </w:p>
+    <w:p>
+      <w:pPr>
+        <w:pStyle w:val="Listing"/>
+      </w:pPr>
+      <w:r>
+        <w:t xml:space="preserve">                if (!ni.isUp() || ni.isLoopback())</w:t>
+      </w:r>
+    </w:p>
+    <w:p>
+      <w:pPr>
+        <w:pStyle w:val="Listing"/>
+      </w:pPr>
+      <w:r>
+        <w:t xml:space="preserve">                    continue;</w:t>
+      </w:r>
+    </w:p>
+    <w:p>
+      <w:pPr>
+        <w:pStyle w:val="Listing"/>
+      </w:pPr>
+      <w:r>
+        <w:t xml:space="preserve">                Enumeration&lt;InetAddress&gt; addresses = ni.getInetAddresses();</w:t>
+      </w:r>
+    </w:p>
+    <w:p>
+      <w:pPr>
+        <w:pStyle w:val="Listing"/>
+      </w:pPr>
+      <w:r>
+        <w:t xml:space="preserve">                while (addresses.hasMoreElements()) {</w:t>
+      </w:r>
+    </w:p>
+    <w:p>
+      <w:pPr>
+        <w:pStyle w:val="Listing"/>
+      </w:pPr>
+      <w:r>
+        <w:t xml:space="preserve">                    InetAddress address = addresses.nextElement();</w:t>
+      </w:r>
+    </w:p>
+    <w:p>
+      <w:pPr>
+        <w:pStyle w:val="Listing"/>
+      </w:pPr>
+      <w:r>
+        <w:t xml:space="preserve">                    if (address instanceof Inet4Address)</w:t>
+      </w:r>
+    </w:p>
+    <w:p>
+      <w:pPr>
+        <w:pStyle w:val="Listing"/>
+      </w:pPr>
+      <w:r>
+        <w:t xml:space="preserve">                        result += address.getHostAddress() + " ";</w:t>
+      </w:r>
+    </w:p>
+    <w:p>
+      <w:pPr>
+        <w:pStyle w:val="Listing"/>
+      </w:pPr>
+      <w:r>
+        <w:t xml:space="preserve">                }</w:t>
+      </w:r>
+    </w:p>
+    <w:p>
+      <w:pPr>
+        <w:pStyle w:val="Listing"/>
+      </w:pPr>
+      <w:r>
+        <w:t xml:space="preserve">            }</w:t>
+      </w:r>
+    </w:p>
+    <w:p>
+      <w:pPr>
+        <w:pStyle w:val="Listing"/>
+      </w:pPr>
+      <w:r>
+        <w:t xml:space="preserve">        } catch (Exception e) {</w:t>
+      </w:r>
+    </w:p>
+    <w:p>
+      <w:pPr>
+        <w:pStyle w:val="Listing"/>
+      </w:pPr>
+      <w:r>
+        <w:t xml:space="preserve">            System.out.println("Ошибка " + e);</w:t>
+      </w:r>
+    </w:p>
+    <w:p>
+      <w:pPr>
+        <w:pStyle w:val="Listing"/>
+      </w:pPr>
+      <w:r>
+        <w:t xml:space="preserve">        }</w:t>
+      </w:r>
+    </w:p>
+    <w:p>
+      <w:pPr>
+        <w:pStyle w:val="Listing"/>
+      </w:pPr>
+      <w:r>
+        <w:t xml:space="preserve">        return result.trim();</w:t>
+      </w:r>
+    </w:p>
+    <w:p>
+      <w:pPr>
+        <w:pStyle w:val="Listing"/>
+      </w:pPr>
+      <w:r>
+        <w:t xml:space="preserve">    }</w:t>
+      </w:r>
+    </w:p>
+    <w:p>
+      <w:pPr>
+        <w:pStyle w:val="Listing"/>
+      </w:pPr>
+    </w:p>
+    <w:p>
+      <w:pPr>
+        <w:pStyle w:val="Listing"/>
+      </w:pPr>
+      <w:r>
+        <w:t xml:space="preserve">    public static void main(String args[]) {</w:t>
+      </w:r>
+    </w:p>
+    <w:p>
+      <w:pPr>
+        <w:pStyle w:val="Listing"/>
+      </w:pPr>
+      <w:r>
+        <w:t xml:space="preserve">        if (args.length == 0) { // сервер и клиенты на одном компьютере</w:t>
+      </w:r>
+    </w:p>
+    <w:p>
+      <w:pPr>
+        <w:pStyle w:val="Listing"/>
+      </w:pPr>
+      <w:r>
+        <w:t xml:space="preserve">            serv f = new serv();</w:t>
+      </w:r>
+    </w:p>
+    <w:p>
+      <w:pPr>
+        <w:pStyle w:val="Listing"/>
+      </w:pPr>
+      <w:r>
+        <w:t xml:space="preserve">            f.setTitle("Счёт (сервер, IP: " + localAddresses() + ")");</w:t>
+      </w:r>
+    </w:p>
+    <w:p>
+      <w:pPr>
+        <w:pStyle w:val="Listing"/>
+      </w:pPr>
+      <w:r>
+        <w:t xml:space="preserve">            f.setSize(400, 400);</w:t>
+      </w:r>
+    </w:p>
+    <w:p>
+      <w:pPr>
+        <w:pStyle w:val="Listing"/>
+      </w:pPr>
+      <w:r>
+        <w:t xml:space="preserve">            f.setVisible(true);</w:t>
+      </w:r>
+    </w:p>
+    <w:p>
+      <w:pPr>
+        <w:pStyle w:val="Listing"/>
+      </w:pPr>
+      <w:r>
+        <w:t xml:space="preserve">            new Account(f).start();</w:t>
+      </w:r>
+    </w:p>
+    <w:p>
+      <w:pPr>
+        <w:pStyle w:val="Listing"/>
+      </w:pPr>
+      <w:r>
+        <w:t xml:space="preserve">        } else { // только клиенты, сервер на другом компьютере</w:t>
+      </w:r>
+    </w:p>
+    <w:p>
+      <w:pPr>
+        <w:pStyle w:val="Listing"/>
+      </w:pPr>
+      <w:r>
+        <w:t xml:space="preserve">            serv f = new serv(args[0]);</w:t>
+      </w:r>
+    </w:p>
+    <w:p>
+      <w:pPr>
+        <w:pStyle w:val="Listing"/>
+      </w:pPr>
+      <w:r>
+        <w:t xml:space="preserve">            f.setTitle("Счёт (клиент, сервер: " + args[0] + ")");</w:t>
+      </w:r>
+    </w:p>
+    <w:p>
+      <w:pPr>
+        <w:pStyle w:val="Listing"/>
+      </w:pPr>
+      <w:r>
+        <w:t xml:space="preserve">            f.setSize(400, 400);</w:t>
+      </w:r>
+    </w:p>
+    <w:p>
+      <w:pPr>
+        <w:pStyle w:val="Listing"/>
+      </w:pPr>
+      <w:r>
+        <w:t xml:space="preserve">            f.setVisible(true);</w:t>
+      </w:r>
+    </w:p>
+    <w:p>
+      <w:pPr>
+        <w:pStyle w:val="Listing"/>
+      </w:pPr>
+      <w:r>
+        <w:t xml:space="preserve">        }</w:t>
+      </w:r>
+    </w:p>
+    <w:p>
+      <w:pPr>
+        <w:pStyle w:val="Listing"/>
+      </w:pPr>
+      <w:r>
+        <w:t xml:space="preserve">    }</w:t>
+      </w:r>
+    </w:p>
+    <w:p>
+      <w:pPr>
+        <w:pStyle w:val="Listing"/>
+      </w:pPr>
+      <w:r>
+        <w:t>}</w:t>
+      </w:r>
+    </w:p>
+    <w:p/>
     <w:sectPr>
       <w:headerReference w:type="default" r:id="rId16"/>
       <w:footerReference w:type="default" r:id="rId17"/>
@@ -5117,31 +5100,31 @@
       </w:rPr>
     </w:lvl>
   </w:abstractNum>
-  <w:num w:numId="1" w16cid:durableId="1644851667">
+  <w:num w:numId="1" w16cid:durableId="1175610129">
     <w:abstractNumId w:val="8"/>
   </w:num>
-  <w:num w:numId="2" w16cid:durableId="972517901">
+  <w:num w:numId="2" w16cid:durableId="906380652">
     <w:abstractNumId w:val="6"/>
   </w:num>
-  <w:num w:numId="3" w16cid:durableId="1084569359">
+  <w:num w:numId="3" w16cid:durableId="1431200486">
     <w:abstractNumId w:val="5"/>
   </w:num>
-  <w:num w:numId="4" w16cid:durableId="782921407">
+  <w:num w:numId="4" w16cid:durableId="1126388472">
     <w:abstractNumId w:val="4"/>
   </w:num>
-  <w:num w:numId="5" w16cid:durableId="1398551594">
+  <w:num w:numId="5" w16cid:durableId="428502528">
     <w:abstractNumId w:val="7"/>
   </w:num>
-  <w:num w:numId="6" w16cid:durableId="759256029">
+  <w:num w:numId="6" w16cid:durableId="908735013">
     <w:abstractNumId w:val="3"/>
   </w:num>
-  <w:num w:numId="7" w16cid:durableId="1056466727">
+  <w:num w:numId="7" w16cid:durableId="1130199122">
     <w:abstractNumId w:val="2"/>
   </w:num>
-  <w:num w:numId="8" w16cid:durableId="1083068941">
+  <w:num w:numId="8" w16cid:durableId="1670864980">
     <w:abstractNumId w:val="1"/>
   </w:num>
-  <w:num w:numId="9" w16cid:durableId="661394823">
+  <w:num w:numId="9" w16cid:durableId="2111195033">
     <w:abstractNumId w:val="0"/>
   </w:num>
 </w:numbering>
@@ -5563,6 +5546,7 @@
       <w:rFonts w:asciiTheme="majorHAnsi" w:eastAsiaTheme="majorEastAsia" w:hAnsiTheme="majorHAnsi" w:cstheme="majorBidi"/>
       <w:b/>
       <w:bCs/>
+      <w:caps/>
       <w:szCs w:val="28"/>
     </w:rPr>
   </w:style>
@@ -16547,7 +16531,7 @@
     <w:autoRedefine/>
     <w:uiPriority w:val="39"/>
     <w:unhideWhenUsed/>
-    <w:rsid w:val="003B7081"/>
+    <w:rsid w:val="00B54EED"/>
     <w:pPr>
       <w:spacing w:after="100"/>
     </w:pPr>
@@ -16559,7 +16543,7 @@
     <w:autoRedefine/>
     <w:uiPriority w:val="39"/>
     <w:unhideWhenUsed/>
-    <w:rsid w:val="003B7081"/>
+    <w:rsid w:val="00B54EED"/>
     <w:pPr>
       <w:spacing w:after="100"/>
       <w:ind w:left="280"/>
@@ -16570,7 +16554,7 @@
     <w:basedOn w:val="a2"/>
     <w:uiPriority w:val="99"/>
     <w:unhideWhenUsed/>
-    <w:rsid w:val="003B7081"/>
+    <w:rsid w:val="00B54EED"/>
     <w:rPr>
       <w:color w:val="0000FF" w:themeColor="hyperlink"/>
       <w:u w:val="single"/>

</xml_diff>